<commit_message>
updates to prompts and template
</commit_message>
<xml_diff>
--- a/Templates/sapai_kcl_template_v0.1.docx
+++ b/Templates/sapai_kcl_template_v0.1.docx
@@ -7772,6 +7772,7 @@
       <w:bookmarkStart w:id="36" w:name="_Toc183099246"/>
       <w:bookmarkStart w:id="37" w:name="_Toc185323536"/>
       <w:commentRangeStart w:id="38"/>
+      <w:commentRangeStart w:id="39"/>
       <w:r>
         <w:t>Measures</w:t>
       </w:r>
@@ -7788,17 +7789,28 @@
         </w:rPr>
         <w:commentReference w:id="38"/>
       </w:r>
+      <w:commentRangeEnd w:id="39"/>
+      <w:r>
+        <w:rPr>
+          <w:rStyle w:val="CommentReference"/>
+          <w:b w:val="0"/>
+          <w:iCs w:val="0"/>
+          <w:u w:val="none"/>
+          <w:lang w:val="en-US"/>
+        </w:rPr>
+        <w:commentReference w:id="39"/>
+      </w:r>
       <w:r>
         <w:fldChar w:fldCharType="begin"/>
       </w:r>
       <w:r>
         <w:instrText xml:space="preserve"> TC "</w:instrText>
       </w:r>
-      <w:bookmarkStart w:id="39" w:name="_Toc183094419"/>
+      <w:bookmarkStart w:id="40" w:name="_Toc183094419"/>
       <w:r>
         <w:instrText>Measures</w:instrText>
       </w:r>
-      <w:bookmarkEnd w:id="39"/>
+      <w:bookmarkEnd w:id="40"/>
       <w:r>
         <w:instrText xml:space="preserve">" \f C \l "1" </w:instrText>
       </w:r>
@@ -7806,75 +7818,81 @@
         <w:fldChar w:fldCharType="end"/>
       </w:r>
     </w:p>
-    <w:p/>
-    <w:p>
-      <w:pPr>
-        <w:pStyle w:val="ListParagraph"/>
-        <w:numPr>
-          <w:ilvl w:val="0"/>
-          <w:numId w:val="31"/>
-        </w:numPr>
-        <w:spacing w:before="0" w:after="0"/>
-        <w:rPr>
-          <w:rFonts w:asciiTheme="minorHAnsi" w:hAnsiTheme="minorHAnsi"/>
-          <w:sz w:val="22"/>
-          <w:szCs w:val="22"/>
-          <w:lang w:val="en-US"/>
-        </w:rPr>
-      </w:pPr>
-      <w:r>
-        <w:rPr>
-          <w:rFonts w:asciiTheme="minorHAnsi" w:hAnsiTheme="minorHAnsi"/>
-          <w:sz w:val="22"/>
-          <w:szCs w:val="22"/>
-          <w:lang w:val="en-US"/>
-        </w:rPr>
-        <w:t>Baseline</w:t>
-      </w:r>
-      <w:r>
-        <w:rPr>
-          <w:rFonts w:asciiTheme="minorHAnsi" w:hAnsiTheme="minorHAnsi"/>
-          <w:sz w:val="22"/>
-          <w:szCs w:val="22"/>
-          <w:lang w:val="en-US"/>
+    <w:p>
+      <w:pPr>
+        <w:rPr>
+          <w:sz w:val="22"/>
+          <w:szCs w:val="22"/>
+        </w:rPr>
+      </w:pPr>
+    </w:p>
+    <w:p>
+      <w:pPr>
+        <w:rPr>
+          <w:b/>
+          <w:bCs/>
+          <w:sz w:val="22"/>
+          <w:szCs w:val="22"/>
+        </w:rPr>
+      </w:pPr>
+      <w:r>
+        <w:rPr>
+          <w:b/>
+          <w:bCs/>
+          <w:sz w:val="22"/>
+          <w:szCs w:val="22"/>
+        </w:rPr>
+        <w:t>Primary outcome</w:t>
+      </w:r>
+    </w:p>
+    <w:p>
+      <w:pPr>
+        <w:rPr>
+          <w:sz w:val="22"/>
+          <w:szCs w:val="22"/>
+        </w:rPr>
+      </w:pPr>
+      <w:r>
+        <w:rPr>
+          <w:sz w:val="22"/>
+          <w:szCs w:val="22"/>
+        </w:rPr>
+        <w:t>{{primary_outcome_measures}}</w:t>
+      </w:r>
+      <w:r>
+        <w:rPr>
+          <w:sz w:val="22"/>
+          <w:szCs w:val="22"/>
         </w:rPr>
         <w:fldChar w:fldCharType="begin"/>
       </w:r>
       <w:r>
         <w:rPr>
-          <w:rFonts w:asciiTheme="minorHAnsi" w:hAnsiTheme="minorHAnsi"/>
-          <w:sz w:val="22"/>
-          <w:szCs w:val="22"/>
-          <w:lang w:val="en-US"/>
+          <w:sz w:val="22"/>
+          <w:szCs w:val="22"/>
         </w:rPr>
         <w:instrText xml:space="preserve"> TC "</w:instrText>
       </w:r>
-      <w:bookmarkStart w:id="40" w:name="_Toc183094420"/>
-      <w:r>
-        <w:rPr>
-          <w:rFonts w:asciiTheme="minorHAnsi" w:hAnsiTheme="minorHAnsi"/>
-          <w:sz w:val="22"/>
-          <w:szCs w:val="22"/>
-          <w:lang w:val="en-US"/>
-        </w:rPr>
-        <w:instrText>Baseline</w:instrText>
-      </w:r>
-      <w:bookmarkEnd w:id="40"/>
-      <w:r>
-        <w:rPr>
-          <w:rFonts w:asciiTheme="minorHAnsi" w:hAnsiTheme="minorHAnsi"/>
-          <w:sz w:val="22"/>
-          <w:szCs w:val="22"/>
-          <w:lang w:val="en-US"/>
+      <w:bookmarkStart w:id="41" w:name="_Toc183094421"/>
+      <w:r>
+        <w:rPr>
+          <w:sz w:val="22"/>
+          <w:szCs w:val="22"/>
+        </w:rPr>
+        <w:instrText>Primary outcome measures</w:instrText>
+      </w:r>
+      <w:bookmarkEnd w:id="41"/>
+      <w:r>
+        <w:rPr>
+          <w:sz w:val="22"/>
+          <w:szCs w:val="22"/>
         </w:rPr>
         <w:instrText xml:space="preserve">" \f C \l "1" </w:instrText>
       </w:r>
       <w:r>
         <w:rPr>
-          <w:rFonts w:asciiTheme="minorHAnsi" w:hAnsiTheme="minorHAnsi"/>
-          <w:sz w:val="22"/>
-          <w:szCs w:val="22"/>
-          <w:lang w:val="en-US"/>
+          <w:sz w:val="22"/>
+          <w:szCs w:val="22"/>
         </w:rPr>
         <w:fldChar w:fldCharType="end"/>
       </w:r>
@@ -7893,82 +7911,71 @@
     </w:p>
     <w:p>
       <w:pPr>
-        <w:pStyle w:val="ListParagraph"/>
-        <w:numPr>
-          <w:ilvl w:val="0"/>
-          <w:numId w:val="31"/>
-        </w:numPr>
-        <w:spacing w:before="0" w:after="0"/>
-        <w:rPr>
-          <w:rFonts w:asciiTheme="minorHAnsi" w:hAnsiTheme="minorHAnsi"/>
-          <w:sz w:val="22"/>
-          <w:szCs w:val="22"/>
-          <w:lang w:val="en-US"/>
-        </w:rPr>
-      </w:pPr>
-      <w:r>
-        <w:rPr>
-          <w:rFonts w:asciiTheme="minorHAnsi" w:hAnsiTheme="minorHAnsi"/>
-          <w:sz w:val="22"/>
-          <w:szCs w:val="22"/>
-          <w:lang w:val="en-US"/>
-        </w:rPr>
-        <w:lastRenderedPageBreak/>
-        <w:t>Primary outcome measures</w:t>
-      </w:r>
-      <w:r>
-        <w:rPr>
-          <w:rFonts w:asciiTheme="minorHAnsi" w:hAnsiTheme="minorHAnsi"/>
-          <w:sz w:val="22"/>
-          <w:szCs w:val="22"/>
-          <w:lang w:val="en-US"/>
-        </w:rPr>
-        <w:t xml:space="preserve"> {{primary_outcome_measures}}</w:t>
-      </w:r>
-      <w:r>
-        <w:rPr>
-          <w:rFonts w:asciiTheme="minorHAnsi" w:hAnsiTheme="minorHAnsi"/>
-          <w:sz w:val="22"/>
-          <w:szCs w:val="22"/>
-          <w:lang w:val="en-US"/>
+        <w:rPr>
+          <w:b/>
+          <w:bCs/>
+          <w:sz w:val="22"/>
+          <w:szCs w:val="22"/>
+        </w:rPr>
+      </w:pPr>
+      <w:r>
+        <w:rPr>
+          <w:b/>
+          <w:bCs/>
+          <w:sz w:val="22"/>
+          <w:szCs w:val="22"/>
+        </w:rPr>
+        <w:t xml:space="preserve">Secondary outcome </w:t>
+      </w:r>
+    </w:p>
+    <w:p>
+      <w:pPr>
+        <w:rPr>
+          <w:sz w:val="22"/>
+          <w:szCs w:val="22"/>
+        </w:rPr>
+      </w:pPr>
+      <w:r>
+        <w:rPr>
+          <w:sz w:val="22"/>
+          <w:szCs w:val="22"/>
+        </w:rPr>
+        <w:t>{{secondary_outcome_measures}}</w:t>
+      </w:r>
+      <w:r>
+        <w:rPr>
+          <w:sz w:val="22"/>
+          <w:szCs w:val="22"/>
         </w:rPr>
         <w:fldChar w:fldCharType="begin"/>
       </w:r>
       <w:r>
         <w:rPr>
-          <w:rFonts w:asciiTheme="minorHAnsi" w:hAnsiTheme="minorHAnsi"/>
-          <w:sz w:val="22"/>
-          <w:szCs w:val="22"/>
-          <w:lang w:val="en-US"/>
+          <w:sz w:val="22"/>
+          <w:szCs w:val="22"/>
         </w:rPr>
         <w:instrText xml:space="preserve"> TC "</w:instrText>
       </w:r>
-      <w:bookmarkStart w:id="41" w:name="_Toc183094421"/>
-      <w:r>
-        <w:rPr>
-          <w:rFonts w:asciiTheme="minorHAnsi" w:hAnsiTheme="minorHAnsi"/>
-          <w:sz w:val="22"/>
-          <w:szCs w:val="22"/>
-          <w:lang w:val="en-US"/>
-        </w:rPr>
-        <w:instrText>Primary outcome measures</w:instrText>
-      </w:r>
-      <w:bookmarkEnd w:id="41"/>
-      <w:r>
-        <w:rPr>
-          <w:rFonts w:asciiTheme="minorHAnsi" w:hAnsiTheme="minorHAnsi"/>
-          <w:sz w:val="22"/>
-          <w:szCs w:val="22"/>
-          <w:lang w:val="en-US"/>
+      <w:bookmarkStart w:id="42" w:name="_Toc183094422"/>
+      <w:r>
+        <w:rPr>
+          <w:sz w:val="22"/>
+          <w:szCs w:val="22"/>
+        </w:rPr>
+        <w:instrText>Secondary outcome measures</w:instrText>
+      </w:r>
+      <w:bookmarkEnd w:id="42"/>
+      <w:r>
+        <w:rPr>
+          <w:sz w:val="22"/>
+          <w:szCs w:val="22"/>
         </w:rPr>
         <w:instrText xml:space="preserve">" \f C \l "1" </w:instrText>
       </w:r>
       <w:r>
         <w:rPr>
-          <w:rFonts w:asciiTheme="minorHAnsi" w:hAnsiTheme="minorHAnsi"/>
-          <w:sz w:val="22"/>
-          <w:szCs w:val="22"/>
-          <w:lang w:val="en-US"/>
+          <w:sz w:val="22"/>
+          <w:szCs w:val="22"/>
         </w:rPr>
         <w:fldChar w:fldCharType="end"/>
       </w:r>
@@ -7987,81 +7994,78 @@
     </w:p>
     <w:p>
       <w:pPr>
-        <w:pStyle w:val="ListParagraph"/>
-        <w:numPr>
-          <w:ilvl w:val="0"/>
-          <w:numId w:val="31"/>
-        </w:numPr>
-        <w:spacing w:before="0" w:after="0"/>
-        <w:rPr>
-          <w:rFonts w:asciiTheme="minorHAnsi" w:hAnsiTheme="minorHAnsi"/>
-          <w:sz w:val="22"/>
-          <w:szCs w:val="22"/>
-          <w:lang w:val="en-US"/>
-        </w:rPr>
-      </w:pPr>
-      <w:r>
-        <w:rPr>
-          <w:rFonts w:asciiTheme="minorHAnsi" w:hAnsiTheme="minorHAnsi"/>
-          <w:sz w:val="22"/>
-          <w:szCs w:val="22"/>
-          <w:lang w:val="en-US"/>
-        </w:rPr>
-        <w:t>Secondary outcome measures</w:t>
-      </w:r>
-      <w:r>
-        <w:rPr>
-          <w:rFonts w:asciiTheme="minorHAnsi" w:hAnsiTheme="minorHAnsi"/>
-          <w:sz w:val="22"/>
-          <w:szCs w:val="22"/>
-          <w:lang w:val="en-US"/>
-        </w:rPr>
-        <w:t xml:space="preserve"> {{secondary_outcome_measures}}</w:t>
-      </w:r>
-      <w:r>
-        <w:rPr>
-          <w:rFonts w:asciiTheme="minorHAnsi" w:hAnsiTheme="minorHAnsi"/>
-          <w:sz w:val="22"/>
-          <w:szCs w:val="22"/>
-          <w:lang w:val="en-US"/>
+        <w:rPr>
+          <w:b/>
+          <w:bCs/>
+          <w:sz w:val="22"/>
+          <w:szCs w:val="22"/>
+        </w:rPr>
+      </w:pPr>
+      <w:r>
+        <w:rPr>
+          <w:b/>
+          <w:bCs/>
+          <w:sz w:val="22"/>
+          <w:szCs w:val="22"/>
+        </w:rPr>
+        <w:t>Mediators of treatment</w:t>
+      </w:r>
+    </w:p>
+    <w:p>
+      <w:pPr>
+        <w:rPr>
+          <w:sz w:val="22"/>
+          <w:szCs w:val="22"/>
+        </w:rPr>
+      </w:pPr>
+      <w:r>
+        <w:rPr>
+          <w:sz w:val="22"/>
+          <w:szCs w:val="22"/>
+        </w:rPr>
+        <w:t>{{</w:t>
+      </w:r>
+      <w:r>
+        <w:rPr>
+          <w:sz w:val="22"/>
+          <w:szCs w:val="22"/>
+        </w:rPr>
+        <w:t>mediator_of_treatment}}</w:t>
+      </w:r>
+      <w:r>
+        <w:rPr>
+          <w:sz w:val="22"/>
+          <w:szCs w:val="22"/>
         </w:rPr>
         <w:fldChar w:fldCharType="begin"/>
       </w:r>
       <w:r>
         <w:rPr>
-          <w:rFonts w:asciiTheme="minorHAnsi" w:hAnsiTheme="minorHAnsi"/>
-          <w:sz w:val="22"/>
-          <w:szCs w:val="22"/>
-          <w:lang w:val="en-US"/>
+          <w:sz w:val="22"/>
+          <w:szCs w:val="22"/>
         </w:rPr>
         <w:instrText xml:space="preserve"> TC "</w:instrText>
       </w:r>
-      <w:bookmarkStart w:id="42" w:name="_Toc183094422"/>
-      <w:r>
-        <w:rPr>
-          <w:rFonts w:asciiTheme="minorHAnsi" w:hAnsiTheme="minorHAnsi"/>
-          <w:sz w:val="22"/>
-          <w:szCs w:val="22"/>
-          <w:lang w:val="en-US"/>
-        </w:rPr>
-        <w:instrText>Secondary outcome measures</w:instrText>
-      </w:r>
-      <w:bookmarkEnd w:id="42"/>
-      <w:r>
-        <w:rPr>
-          <w:rFonts w:asciiTheme="minorHAnsi" w:hAnsiTheme="minorHAnsi"/>
-          <w:sz w:val="22"/>
-          <w:szCs w:val="22"/>
-          <w:lang w:val="en-US"/>
+      <w:bookmarkStart w:id="43" w:name="_Toc183094423"/>
+      <w:r>
+        <w:rPr>
+          <w:sz w:val="22"/>
+          <w:szCs w:val="22"/>
+        </w:rPr>
+        <w:instrText>Mediators of treatment</w:instrText>
+      </w:r>
+      <w:bookmarkEnd w:id="43"/>
+      <w:r>
+        <w:rPr>
+          <w:sz w:val="22"/>
+          <w:szCs w:val="22"/>
         </w:rPr>
         <w:instrText xml:space="preserve">" \f C \l "1" </w:instrText>
       </w:r>
       <w:r>
         <w:rPr>
-          <w:rFonts w:asciiTheme="minorHAnsi" w:hAnsiTheme="minorHAnsi"/>
-          <w:sz w:val="22"/>
-          <w:szCs w:val="22"/>
-          <w:lang w:val="en-US"/>
+          <w:sz w:val="22"/>
+          <w:szCs w:val="22"/>
         </w:rPr>
         <w:fldChar w:fldCharType="end"/>
       </w:r>
@@ -8080,90 +8084,80 @@
     </w:p>
     <w:p>
       <w:pPr>
-        <w:pStyle w:val="ListParagraph"/>
-        <w:numPr>
-          <w:ilvl w:val="0"/>
-          <w:numId w:val="31"/>
-        </w:numPr>
-        <w:spacing w:before="0" w:after="0"/>
-        <w:rPr>
-          <w:rFonts w:asciiTheme="minorHAnsi" w:hAnsiTheme="minorHAnsi"/>
-          <w:sz w:val="22"/>
-          <w:szCs w:val="22"/>
-          <w:lang w:val="en-US"/>
-        </w:rPr>
-      </w:pPr>
-      <w:r>
-        <w:rPr>
-          <w:rFonts w:asciiTheme="minorHAnsi" w:hAnsiTheme="minorHAnsi"/>
-          <w:sz w:val="22"/>
-          <w:szCs w:val="22"/>
-          <w:lang w:val="en-US"/>
-        </w:rPr>
-        <w:t>Mediators of treatment</w:t>
-      </w:r>
-      <w:r>
-        <w:rPr>
-          <w:rFonts w:asciiTheme="minorHAnsi" w:hAnsiTheme="minorHAnsi"/>
-          <w:sz w:val="22"/>
-          <w:szCs w:val="22"/>
-          <w:lang w:val="en-US"/>
-        </w:rPr>
-        <w:t xml:space="preserve"> {{</w:t>
-      </w:r>
-      <w:r>
-        <w:rPr>
-          <w:rFonts w:asciiTheme="minorHAnsi" w:hAnsiTheme="minorHAnsi"/>
-          <w:sz w:val="22"/>
-          <w:szCs w:val="22"/>
-          <w:lang w:val="en-US"/>
-        </w:rPr>
-        <w:t>mediator_of_treatment}}</w:t>
-      </w:r>
-      <w:r>
-        <w:rPr>
-          <w:rFonts w:asciiTheme="minorHAnsi" w:hAnsiTheme="minorHAnsi"/>
-          <w:sz w:val="22"/>
-          <w:szCs w:val="22"/>
-          <w:lang w:val="en-US"/>
+        <w:rPr>
+          <w:b/>
+          <w:bCs/>
+          <w:sz w:val="22"/>
+          <w:szCs w:val="22"/>
+        </w:rPr>
+      </w:pPr>
+      <w:r>
+        <w:rPr>
+          <w:b/>
+          <w:bCs/>
+          <w:sz w:val="22"/>
+          <w:szCs w:val="22"/>
+        </w:rPr>
+        <w:t>Moderators of treatment</w:t>
+      </w:r>
+      <w:r>
+        <w:rPr>
+          <w:b/>
+          <w:bCs/>
+          <w:sz w:val="22"/>
+          <w:szCs w:val="22"/>
+        </w:rPr>
+        <w:t xml:space="preserve"> </w:t>
+      </w:r>
+    </w:p>
+    <w:p>
+      <w:pPr>
+        <w:rPr>
+          <w:sz w:val="22"/>
+          <w:szCs w:val="22"/>
+        </w:rPr>
+      </w:pPr>
+      <w:r>
+        <w:rPr>
+          <w:sz w:val="22"/>
+          <w:szCs w:val="22"/>
+        </w:rPr>
+        <w:t>{{moderator_of_treatment}}</w:t>
+      </w:r>
+      <w:r>
+        <w:rPr>
+          <w:sz w:val="22"/>
+          <w:szCs w:val="22"/>
         </w:rPr>
         <w:fldChar w:fldCharType="begin"/>
       </w:r>
       <w:r>
         <w:rPr>
-          <w:rFonts w:asciiTheme="minorHAnsi" w:hAnsiTheme="minorHAnsi"/>
-          <w:sz w:val="22"/>
-          <w:szCs w:val="22"/>
-          <w:lang w:val="en-US"/>
+          <w:sz w:val="22"/>
+          <w:szCs w:val="22"/>
         </w:rPr>
         <w:instrText xml:space="preserve"> TC "</w:instrText>
       </w:r>
-      <w:bookmarkStart w:id="43" w:name="_Toc183094423"/>
-      <w:r>
-        <w:rPr>
-          <w:rFonts w:asciiTheme="minorHAnsi" w:hAnsiTheme="minorHAnsi"/>
-          <w:sz w:val="22"/>
-          <w:szCs w:val="22"/>
-          <w:lang w:val="en-US"/>
-        </w:rPr>
-        <w:instrText>Mediators of treatment</w:instrText>
-      </w:r>
-      <w:bookmarkEnd w:id="43"/>
-      <w:r>
-        <w:rPr>
-          <w:rFonts w:asciiTheme="minorHAnsi" w:hAnsiTheme="minorHAnsi"/>
-          <w:sz w:val="22"/>
-          <w:szCs w:val="22"/>
-          <w:lang w:val="en-US"/>
+      <w:bookmarkStart w:id="44" w:name="_Toc183094424"/>
+      <w:r>
+        <w:rPr>
+          <w:sz w:val="22"/>
+          <w:szCs w:val="22"/>
+        </w:rPr>
+        <w:instrText>Moderators of treatment</w:instrText>
+      </w:r>
+      <w:bookmarkEnd w:id="44"/>
+      <w:r>
+        <w:rPr>
+          <w:sz w:val="22"/>
+          <w:szCs w:val="22"/>
         </w:rPr>
         <w:instrText xml:space="preserve">" \f C \l "1" </w:instrText>
       </w:r>
       <w:r>
         <w:rPr>
-          <w:rFonts w:asciiTheme="minorHAnsi" w:hAnsiTheme="minorHAnsi"/>
-          <w:sz w:val="22"/>
-          <w:szCs w:val="22"/>
-          <w:lang w:val="en-US"/>
+          <w:sz w:val="22"/>
+          <w:szCs w:val="22"/>
         </w:rPr>
         <w:fldChar w:fldCharType="end"/>
       </w:r>
@@ -8182,81 +8176,80 @@
     </w:p>
     <w:p>
       <w:pPr>
-        <w:pStyle w:val="ListParagraph"/>
-        <w:numPr>
-          <w:ilvl w:val="0"/>
-          <w:numId w:val="31"/>
-        </w:numPr>
-        <w:spacing w:before="0" w:after="0"/>
-        <w:rPr>
-          <w:rFonts w:asciiTheme="minorHAnsi" w:hAnsiTheme="minorHAnsi"/>
-          <w:sz w:val="22"/>
-          <w:szCs w:val="22"/>
-          <w:lang w:val="en-US"/>
-        </w:rPr>
-      </w:pPr>
-      <w:r>
-        <w:rPr>
-          <w:rFonts w:asciiTheme="minorHAnsi" w:hAnsiTheme="minorHAnsi"/>
-          <w:sz w:val="22"/>
-          <w:szCs w:val="22"/>
-          <w:lang w:val="en-US"/>
-        </w:rPr>
-        <w:t>Moderators of treatment</w:t>
-      </w:r>
-      <w:r>
-        <w:rPr>
-          <w:rFonts w:asciiTheme="minorHAnsi" w:hAnsiTheme="minorHAnsi"/>
-          <w:sz w:val="22"/>
-          <w:szCs w:val="22"/>
-          <w:lang w:val="en-US"/>
-        </w:rPr>
-        <w:t xml:space="preserve"> {{moderator_of_treatment}}</w:t>
-      </w:r>
-      <w:r>
-        <w:rPr>
-          <w:rFonts w:asciiTheme="minorHAnsi" w:hAnsiTheme="minorHAnsi"/>
-          <w:sz w:val="22"/>
-          <w:szCs w:val="22"/>
-          <w:lang w:val="en-US"/>
+        <w:rPr>
+          <w:b/>
+          <w:bCs/>
+          <w:sz w:val="22"/>
+          <w:szCs w:val="22"/>
+        </w:rPr>
+      </w:pPr>
+      <w:r>
+        <w:rPr>
+          <w:b/>
+          <w:bCs/>
+          <w:sz w:val="22"/>
+          <w:szCs w:val="22"/>
+        </w:rPr>
+        <w:t>Process indicators</w:t>
+      </w:r>
+      <w:r>
+        <w:rPr>
+          <w:b/>
+          <w:bCs/>
+          <w:sz w:val="22"/>
+          <w:szCs w:val="22"/>
+        </w:rPr>
+        <w:t xml:space="preserve"> </w:t>
+      </w:r>
+    </w:p>
+    <w:p>
+      <w:pPr>
+        <w:rPr>
+          <w:sz w:val="22"/>
+          <w:szCs w:val="22"/>
+        </w:rPr>
+      </w:pPr>
+      <w:r>
+        <w:rPr>
+          <w:sz w:val="22"/>
+          <w:szCs w:val="22"/>
+        </w:rPr>
+        <w:t xml:space="preserve">{{process_indicators}} </w:t>
+      </w:r>
+      <w:r>
+        <w:rPr>
+          <w:sz w:val="22"/>
+          <w:szCs w:val="22"/>
         </w:rPr>
         <w:fldChar w:fldCharType="begin"/>
       </w:r>
       <w:r>
         <w:rPr>
-          <w:rFonts w:asciiTheme="minorHAnsi" w:hAnsiTheme="minorHAnsi"/>
-          <w:sz w:val="22"/>
-          <w:szCs w:val="22"/>
-          <w:lang w:val="en-US"/>
+          <w:sz w:val="22"/>
+          <w:szCs w:val="22"/>
         </w:rPr>
         <w:instrText xml:space="preserve"> TC "</w:instrText>
       </w:r>
-      <w:bookmarkStart w:id="44" w:name="_Toc183094424"/>
-      <w:r>
-        <w:rPr>
-          <w:rFonts w:asciiTheme="minorHAnsi" w:hAnsiTheme="minorHAnsi"/>
-          <w:sz w:val="22"/>
-          <w:szCs w:val="22"/>
-          <w:lang w:val="en-US"/>
-        </w:rPr>
-        <w:instrText>Moderators of treatment</w:instrText>
-      </w:r>
-      <w:bookmarkEnd w:id="44"/>
-      <w:r>
-        <w:rPr>
-          <w:rFonts w:asciiTheme="minorHAnsi" w:hAnsiTheme="minorHAnsi"/>
-          <w:sz w:val="22"/>
-          <w:szCs w:val="22"/>
-          <w:lang w:val="en-US"/>
+      <w:bookmarkStart w:id="45" w:name="_Toc183094425"/>
+      <w:r>
+        <w:rPr>
+          <w:sz w:val="22"/>
+          <w:szCs w:val="22"/>
+        </w:rPr>
+        <w:instrText>Process indicators</w:instrText>
+      </w:r>
+      <w:bookmarkEnd w:id="45"/>
+      <w:r>
+        <w:rPr>
+          <w:sz w:val="22"/>
+          <w:szCs w:val="22"/>
         </w:rPr>
         <w:instrText xml:space="preserve">" \f C \l "1" </w:instrText>
       </w:r>
       <w:r>
         <w:rPr>
-          <w:rFonts w:asciiTheme="minorHAnsi" w:hAnsiTheme="minorHAnsi"/>
-          <w:sz w:val="22"/>
-          <w:szCs w:val="22"/>
-          <w:lang w:val="en-US"/>
+          <w:sz w:val="22"/>
+          <w:szCs w:val="22"/>
         </w:rPr>
         <w:fldChar w:fldCharType="end"/>
       </w:r>
@@ -8275,117 +8268,80 @@
     </w:p>
     <w:p>
       <w:pPr>
-        <w:pStyle w:val="ListParagraph"/>
-        <w:numPr>
-          <w:ilvl w:val="0"/>
-          <w:numId w:val="31"/>
-        </w:numPr>
-        <w:spacing w:before="0" w:after="0"/>
-        <w:rPr>
-          <w:rFonts w:asciiTheme="minorHAnsi" w:hAnsiTheme="minorHAnsi"/>
-          <w:sz w:val="22"/>
-          <w:szCs w:val="22"/>
-          <w:lang w:val="en-US"/>
-        </w:rPr>
-      </w:pPr>
-      <w:r>
-        <w:rPr>
-          <w:rFonts w:asciiTheme="minorHAnsi" w:hAnsiTheme="minorHAnsi"/>
-          <w:sz w:val="22"/>
-          <w:szCs w:val="22"/>
-          <w:lang w:val="en-US"/>
-        </w:rPr>
-        <w:t>Process indicators</w:t>
-      </w:r>
-      <w:r>
-        <w:rPr>
-          <w:rFonts w:asciiTheme="minorHAnsi" w:hAnsiTheme="minorHAnsi"/>
-          <w:sz w:val="22"/>
-          <w:szCs w:val="22"/>
-          <w:lang w:val="en-US"/>
+        <w:rPr>
+          <w:b/>
+          <w:bCs/>
+          <w:sz w:val="22"/>
+          <w:szCs w:val="22"/>
+        </w:rPr>
+      </w:pPr>
+      <w:r>
+        <w:rPr>
+          <w:b/>
+          <w:bCs/>
+          <w:sz w:val="22"/>
+          <w:szCs w:val="22"/>
+        </w:rPr>
+        <w:t>Adverse events</w:t>
+      </w:r>
+      <w:r>
+        <w:rPr>
+          <w:b/>
+          <w:bCs/>
+          <w:sz w:val="22"/>
+          <w:szCs w:val="22"/>
         </w:rPr>
         <w:t xml:space="preserve"> </w:t>
       </w:r>
-      <w:r>
-        <w:rPr>
-          <w:rFonts w:asciiTheme="minorHAnsi" w:hAnsiTheme="minorHAnsi"/>
-          <w:sz w:val="22"/>
-          <w:szCs w:val="22"/>
-          <w:lang w:val="en-US"/>
-        </w:rPr>
-        <w:t>{{</w:t>
-      </w:r>
-      <w:r>
-        <w:rPr>
-          <w:rFonts w:asciiTheme="minorHAnsi" w:hAnsiTheme="minorHAnsi"/>
-          <w:sz w:val="22"/>
-          <w:szCs w:val="22"/>
-          <w:lang w:val="en-US"/>
-        </w:rPr>
-        <w:t>process_indicators</w:t>
-      </w:r>
-      <w:r>
-        <w:rPr>
-          <w:rFonts w:asciiTheme="minorHAnsi" w:hAnsiTheme="minorHAnsi"/>
-          <w:sz w:val="22"/>
-          <w:szCs w:val="22"/>
-          <w:lang w:val="en-US"/>
-        </w:rPr>
-        <w:t>}}</w:t>
-      </w:r>
-      <w:r>
-        <w:rPr>
-          <w:rFonts w:asciiTheme="minorHAnsi" w:hAnsiTheme="minorHAnsi"/>
-          <w:sz w:val="22"/>
-          <w:szCs w:val="22"/>
-          <w:lang w:val="en-US"/>
-        </w:rPr>
-        <w:t xml:space="preserve"> </w:t>
-      </w:r>
-      <w:r>
-        <w:rPr>
-          <w:rFonts w:asciiTheme="minorHAnsi" w:hAnsiTheme="minorHAnsi"/>
-          <w:sz w:val="22"/>
-          <w:szCs w:val="22"/>
-          <w:lang w:val="en-US"/>
+    </w:p>
+    <w:p>
+      <w:pPr>
+        <w:rPr>
+          <w:sz w:val="22"/>
+          <w:szCs w:val="22"/>
+        </w:rPr>
+      </w:pPr>
+      <w:r>
+        <w:rPr>
+          <w:sz w:val="22"/>
+          <w:szCs w:val="22"/>
+        </w:rPr>
+        <w:t xml:space="preserve">{{adverse_events}} </w:t>
+      </w:r>
+      <w:r>
+        <w:rPr>
+          <w:sz w:val="22"/>
+          <w:szCs w:val="22"/>
         </w:rPr>
         <w:fldChar w:fldCharType="begin"/>
       </w:r>
       <w:r>
         <w:rPr>
-          <w:rFonts w:asciiTheme="minorHAnsi" w:hAnsiTheme="minorHAnsi"/>
-          <w:sz w:val="22"/>
-          <w:szCs w:val="22"/>
-          <w:lang w:val="en-US"/>
+          <w:sz w:val="22"/>
+          <w:szCs w:val="22"/>
         </w:rPr>
         <w:instrText xml:space="preserve"> TC "</w:instrText>
       </w:r>
-      <w:bookmarkStart w:id="45" w:name="_Toc183094425"/>
-      <w:r>
-        <w:rPr>
-          <w:rFonts w:asciiTheme="minorHAnsi" w:hAnsiTheme="minorHAnsi"/>
-          <w:sz w:val="22"/>
-          <w:szCs w:val="22"/>
-          <w:lang w:val="en-US"/>
-        </w:rPr>
-        <w:instrText>Process indicators</w:instrText>
-      </w:r>
-      <w:bookmarkEnd w:id="45"/>
-      <w:r>
-        <w:rPr>
-          <w:rFonts w:asciiTheme="minorHAnsi" w:hAnsiTheme="minorHAnsi"/>
-          <w:sz w:val="22"/>
-          <w:szCs w:val="22"/>
-          <w:lang w:val="en-US"/>
+      <w:bookmarkStart w:id="46" w:name="_Toc183094426"/>
+      <w:r>
+        <w:rPr>
+          <w:sz w:val="22"/>
+          <w:szCs w:val="22"/>
+        </w:rPr>
+        <w:instrText>Adverse events</w:instrText>
+      </w:r>
+      <w:bookmarkEnd w:id="46"/>
+      <w:r>
+        <w:rPr>
+          <w:sz w:val="22"/>
+          <w:szCs w:val="22"/>
         </w:rPr>
         <w:instrText xml:space="preserve">" \f C \l "1" </w:instrText>
       </w:r>
       <w:r>
         <w:rPr>
-          <w:rFonts w:asciiTheme="minorHAnsi" w:hAnsiTheme="minorHAnsi"/>
-          <w:sz w:val="22"/>
-          <w:szCs w:val="22"/>
-          <w:lang w:val="en-US"/>
+          <w:sz w:val="22"/>
+          <w:szCs w:val="22"/>
         </w:rPr>
         <w:fldChar w:fldCharType="end"/>
       </w:r>
@@ -8404,117 +8360,71 @@
     </w:p>
     <w:p>
       <w:pPr>
-        <w:pStyle w:val="ListParagraph"/>
-        <w:numPr>
-          <w:ilvl w:val="0"/>
-          <w:numId w:val="31"/>
-        </w:numPr>
-        <w:spacing w:before="0" w:after="0"/>
-        <w:rPr>
-          <w:rFonts w:asciiTheme="minorHAnsi" w:hAnsiTheme="minorHAnsi"/>
-          <w:sz w:val="22"/>
-          <w:szCs w:val="22"/>
-          <w:lang w:val="en-US"/>
-        </w:rPr>
-      </w:pPr>
-      <w:r>
-        <w:rPr>
-          <w:rFonts w:asciiTheme="minorHAnsi" w:hAnsiTheme="minorHAnsi"/>
-          <w:sz w:val="22"/>
-          <w:szCs w:val="22"/>
-          <w:lang w:val="en-US"/>
-        </w:rPr>
-        <w:t>Adverse events</w:t>
-      </w:r>
-      <w:r>
-        <w:rPr>
-          <w:rFonts w:asciiTheme="minorHAnsi" w:hAnsiTheme="minorHAnsi"/>
-          <w:sz w:val="22"/>
-          <w:szCs w:val="22"/>
-          <w:lang w:val="en-US"/>
-        </w:rPr>
-        <w:t xml:space="preserve"> </w:t>
-      </w:r>
-      <w:r>
-        <w:rPr>
-          <w:rFonts w:asciiTheme="minorHAnsi" w:hAnsiTheme="minorHAnsi"/>
-          <w:sz w:val="22"/>
-          <w:szCs w:val="22"/>
-          <w:lang w:val="en-US"/>
-        </w:rPr>
-        <w:t>{{</w:t>
-      </w:r>
-      <w:r>
-        <w:rPr>
-          <w:rFonts w:asciiTheme="minorHAnsi" w:hAnsiTheme="minorHAnsi"/>
-          <w:sz w:val="22"/>
-          <w:szCs w:val="22"/>
-          <w:lang w:val="en-US"/>
-        </w:rPr>
-        <w:t>adverse_events</w:t>
-      </w:r>
-      <w:r>
-        <w:rPr>
-          <w:rFonts w:asciiTheme="minorHAnsi" w:hAnsiTheme="minorHAnsi"/>
-          <w:sz w:val="22"/>
-          <w:szCs w:val="22"/>
-          <w:lang w:val="en-US"/>
-        </w:rPr>
-        <w:t>}}</w:t>
-      </w:r>
-      <w:r>
-        <w:rPr>
-          <w:rFonts w:asciiTheme="minorHAnsi" w:hAnsiTheme="minorHAnsi"/>
-          <w:sz w:val="22"/>
-          <w:szCs w:val="22"/>
-          <w:lang w:val="en-US"/>
-        </w:rPr>
-        <w:t xml:space="preserve"> </w:t>
-      </w:r>
-      <w:r>
-        <w:rPr>
-          <w:rFonts w:asciiTheme="minorHAnsi" w:hAnsiTheme="minorHAnsi"/>
-          <w:sz w:val="22"/>
-          <w:szCs w:val="22"/>
-          <w:lang w:val="en-US"/>
+        <w:rPr>
+          <w:b/>
+          <w:bCs/>
+          <w:sz w:val="22"/>
+          <w:szCs w:val="22"/>
+        </w:rPr>
+      </w:pPr>
+      <w:r>
+        <w:rPr>
+          <w:b/>
+          <w:bCs/>
+          <w:sz w:val="22"/>
+          <w:szCs w:val="22"/>
+        </w:rPr>
+        <w:t>Additional pre-randomisation (baseline) measures</w:t>
+      </w:r>
+    </w:p>
+    <w:p>
+      <w:pPr>
+        <w:rPr>
+          <w:sz w:val="22"/>
+          <w:szCs w:val="22"/>
+        </w:rPr>
+      </w:pPr>
+      <w:r>
+        <w:rPr>
+          <w:sz w:val="22"/>
+          <w:szCs w:val="22"/>
+        </w:rPr>
+        <w:t>{{only_baseline_measures}}</w:t>
+      </w:r>
+      <w:r>
+        <w:rPr>
+          <w:sz w:val="22"/>
+          <w:szCs w:val="22"/>
         </w:rPr>
         <w:fldChar w:fldCharType="begin"/>
       </w:r>
       <w:r>
         <w:rPr>
-          <w:rFonts w:asciiTheme="minorHAnsi" w:hAnsiTheme="minorHAnsi"/>
-          <w:sz w:val="22"/>
-          <w:szCs w:val="22"/>
-          <w:lang w:val="en-US"/>
+          <w:sz w:val="22"/>
+          <w:szCs w:val="22"/>
         </w:rPr>
         <w:instrText xml:space="preserve"> TC "</w:instrText>
       </w:r>
-      <w:bookmarkStart w:id="46" w:name="_Toc183094426"/>
-      <w:r>
-        <w:rPr>
-          <w:rFonts w:asciiTheme="minorHAnsi" w:hAnsiTheme="minorHAnsi"/>
-          <w:sz w:val="22"/>
-          <w:szCs w:val="22"/>
-          <w:lang w:val="en-US"/>
-        </w:rPr>
-        <w:instrText>Adverse events</w:instrText>
-      </w:r>
-      <w:bookmarkEnd w:id="46"/>
-      <w:r>
-        <w:rPr>
-          <w:rFonts w:asciiTheme="minorHAnsi" w:hAnsiTheme="minorHAnsi"/>
-          <w:sz w:val="22"/>
-          <w:szCs w:val="22"/>
-          <w:lang w:val="en-US"/>
+      <w:bookmarkStart w:id="47" w:name="_Toc183094427"/>
+      <w:r>
+        <w:rPr>
+          <w:sz w:val="22"/>
+          <w:szCs w:val="22"/>
+        </w:rPr>
+        <w:instrText>Additional pre-randomisation (baseline) measures</w:instrText>
+      </w:r>
+      <w:bookmarkEnd w:id="47"/>
+      <w:r>
+        <w:rPr>
+          <w:sz w:val="22"/>
+          <w:szCs w:val="22"/>
         </w:rPr>
         <w:instrText xml:space="preserve">" \f C \l "1" </w:instrText>
       </w:r>
       <w:r>
         <w:rPr>
-          <w:rFonts w:asciiTheme="minorHAnsi" w:hAnsiTheme="minorHAnsi"/>
-          <w:sz w:val="22"/>
-          <w:szCs w:val="22"/>
-          <w:lang w:val="en-US"/>
+          <w:sz w:val="22"/>
+          <w:szCs w:val="22"/>
         </w:rPr>
         <w:fldChar w:fldCharType="end"/>
       </w:r>
@@ -8533,175 +8443,55 @@
     </w:p>
     <w:p>
       <w:pPr>
-        <w:pStyle w:val="ListParagraph"/>
-        <w:numPr>
-          <w:ilvl w:val="0"/>
-          <w:numId w:val="31"/>
-        </w:numPr>
-        <w:spacing w:before="0" w:after="0"/>
-        <w:rPr>
-          <w:rFonts w:asciiTheme="minorHAnsi" w:hAnsiTheme="minorHAnsi"/>
-          <w:sz w:val="22"/>
-          <w:szCs w:val="22"/>
-          <w:lang w:val="en-US"/>
-        </w:rPr>
-      </w:pPr>
-      <w:r>
-        <w:rPr>
-          <w:rFonts w:asciiTheme="minorHAnsi" w:hAnsiTheme="minorHAnsi"/>
-          <w:sz w:val="22"/>
-          <w:szCs w:val="22"/>
-          <w:lang w:val="en-US"/>
-        </w:rPr>
-        <w:t>Additional pre-randomisation (baseline) measures</w:t>
-      </w:r>
-      <w:r>
-        <w:rPr>
-          <w:rFonts w:asciiTheme="minorHAnsi" w:hAnsiTheme="minorHAnsi"/>
-          <w:sz w:val="22"/>
-          <w:szCs w:val="22"/>
-          <w:lang w:val="en-US"/>
-        </w:rPr>
-        <w:t xml:space="preserve"> {{only_baseline_measures}}</w:t>
-      </w:r>
-      <w:r>
-        <w:rPr>
-          <w:rFonts w:asciiTheme="minorHAnsi" w:hAnsiTheme="minorHAnsi"/>
-          <w:sz w:val="22"/>
-          <w:szCs w:val="22"/>
-          <w:lang w:val="en-US"/>
-        </w:rPr>
+        <w:rPr>
+          <w:b/>
+          <w:bCs/>
+          <w:sz w:val="22"/>
+          <w:szCs w:val="22"/>
+        </w:rPr>
+      </w:pPr>
+      <w:r>
+        <w:rPr>
+          <w:b/>
+          <w:bCs/>
+          <w:sz w:val="22"/>
+          <w:szCs w:val="22"/>
+        </w:rPr>
+        <w:t>Additional post-randomisation (follow-up) measures</w:t>
+      </w:r>
+      <w:r>
+        <w:rPr>
+          <w:b/>
+          <w:bCs/>
+          <w:sz w:val="22"/>
+          <w:szCs w:val="22"/>
+        </w:rPr>
+        <w:t xml:space="preserve"> </w:t>
+      </w:r>
+    </w:p>
+    <w:p>
+      <w:r>
+        <w:rPr>
+          <w:sz w:val="22"/>
+          <w:szCs w:val="22"/>
+        </w:rPr>
+        <w:t>{{additional_follow_up_measures}}</w:t>
+      </w:r>
+      <w:r>
         <w:fldChar w:fldCharType="begin"/>
       </w:r>
       <w:r>
-        <w:rPr>
-          <w:rFonts w:asciiTheme="minorHAnsi" w:hAnsiTheme="minorHAnsi"/>
-          <w:sz w:val="22"/>
-          <w:szCs w:val="22"/>
-          <w:lang w:val="en-US"/>
-        </w:rPr>
         <w:instrText xml:space="preserve"> TC "</w:instrText>
       </w:r>
-      <w:bookmarkStart w:id="47" w:name="_Toc183094427"/>
-      <w:r>
-        <w:rPr>
-          <w:rFonts w:asciiTheme="minorHAnsi" w:hAnsiTheme="minorHAnsi"/>
-          <w:sz w:val="22"/>
-          <w:szCs w:val="22"/>
-          <w:lang w:val="en-US"/>
-        </w:rPr>
-        <w:instrText>Additional pre-randomisation (baseline) measures</w:instrText>
-      </w:r>
-      <w:bookmarkEnd w:id="47"/>
-      <w:r>
-        <w:rPr>
-          <w:rFonts w:asciiTheme="minorHAnsi" w:hAnsiTheme="minorHAnsi"/>
-          <w:sz w:val="22"/>
-          <w:szCs w:val="22"/>
-          <w:lang w:val="en-US"/>
-        </w:rPr>
+      <w:bookmarkStart w:id="48" w:name="_Toc183094428"/>
+      <w:r>
+        <w:instrText>Additional post-randomisation (follow-up) measures</w:instrText>
+      </w:r>
+      <w:bookmarkEnd w:id="48"/>
+      <w:r>
         <w:instrText xml:space="preserve">" \f C \l "1" </w:instrText>
       </w:r>
       <w:r>
-        <w:rPr>
-          <w:rFonts w:asciiTheme="minorHAnsi" w:hAnsiTheme="minorHAnsi"/>
-          <w:sz w:val="22"/>
-          <w:szCs w:val="22"/>
-          <w:lang w:val="en-US"/>
-        </w:rPr>
-        <w:fldChar w:fldCharType="end"/>
-      </w:r>
-    </w:p>
-    <w:p>
-      <w:pPr>
-        <w:pStyle w:val="ListParagraph"/>
-        <w:spacing w:before="0" w:after="0"/>
-        <w:rPr>
-          <w:rFonts w:asciiTheme="minorHAnsi" w:hAnsiTheme="minorHAnsi"/>
-          <w:sz w:val="22"/>
-          <w:szCs w:val="22"/>
-          <w:lang w:val="en-US"/>
-        </w:rPr>
-      </w:pPr>
-    </w:p>
-    <w:p>
-      <w:pPr>
-        <w:pStyle w:val="ListParagraph"/>
-        <w:numPr>
-          <w:ilvl w:val="0"/>
-          <w:numId w:val="31"/>
-        </w:numPr>
-        <w:spacing w:before="0" w:after="0"/>
-        <w:rPr>
-          <w:rFonts w:asciiTheme="minorHAnsi" w:hAnsiTheme="minorHAnsi"/>
-          <w:sz w:val="24"/>
-          <w:szCs w:val="24"/>
-          <w:lang w:val="en-US"/>
-        </w:rPr>
-      </w:pPr>
-      <w:r>
-        <w:rPr>
-          <w:rFonts w:asciiTheme="minorHAnsi" w:hAnsiTheme="minorHAnsi"/>
-          <w:sz w:val="22"/>
-          <w:szCs w:val="22"/>
-          <w:lang w:val="en-US"/>
-        </w:rPr>
-        <w:t>Additional post-randomisation (follow-up) measures</w:t>
-      </w:r>
-      <w:r>
-        <w:rPr>
-          <w:rFonts w:asciiTheme="minorHAnsi" w:hAnsiTheme="minorHAnsi"/>
-          <w:sz w:val="22"/>
-          <w:szCs w:val="22"/>
-          <w:lang w:val="en-US"/>
-        </w:rPr>
-        <w:t xml:space="preserve"> {{additional_follow_up_measures}}</w:t>
-      </w:r>
-      <w:r>
-        <w:rPr>
-          <w:rFonts w:asciiTheme="minorHAnsi" w:hAnsiTheme="minorHAnsi"/>
-          <w:sz w:val="24"/>
-          <w:szCs w:val="24"/>
-          <w:lang w:val="en-US"/>
-        </w:rPr>
-        <w:fldChar w:fldCharType="begin"/>
-      </w:r>
-      <w:r>
-        <w:rPr>
-          <w:rFonts w:asciiTheme="minorHAnsi" w:hAnsiTheme="minorHAnsi"/>
-          <w:sz w:val="24"/>
-          <w:szCs w:val="24"/>
-          <w:lang w:val="en-US"/>
-        </w:rPr>
-        <w:instrText xml:space="preserve"> TC "</w:instrText>
-      </w:r>
-      <w:bookmarkStart w:id="48" w:name="_Toc183094428"/>
-      <w:r>
-        <w:rPr>
-          <w:rFonts w:asciiTheme="minorHAnsi" w:hAnsiTheme="minorHAnsi"/>
-          <w:sz w:val="24"/>
-          <w:szCs w:val="24"/>
-          <w:lang w:val="en-US"/>
-        </w:rPr>
-        <w:instrText>Additional post-randomisation (follow-up) measures</w:instrText>
-      </w:r>
-      <w:bookmarkEnd w:id="48"/>
-      <w:r>
-        <w:rPr>
-          <w:rFonts w:asciiTheme="minorHAnsi" w:hAnsiTheme="minorHAnsi"/>
-          <w:sz w:val="24"/>
-          <w:szCs w:val="24"/>
-          <w:lang w:val="en-US"/>
-        </w:rPr>
-        <w:instrText xml:space="preserve">" \f C \l "1" </w:instrText>
-      </w:r>
-      <w:r>
-        <w:rPr>
-          <w:rFonts w:asciiTheme="minorHAnsi" w:hAnsiTheme="minorHAnsi"/>
-          <w:sz w:val="24"/>
-          <w:szCs w:val="24"/>
-          <w:lang w:val="en-US"/>
-        </w:rPr>
         <w:fldChar w:fldCharType="end"/>
       </w:r>
     </w:p>
@@ -8714,6 +8504,7 @@
       <w:bookmarkStart w:id="50" w:name="_Toc183099247"/>
       <w:bookmarkStart w:id="51" w:name="_Toc185323538"/>
       <w:bookmarkEnd w:id="49"/>
+      <w:commentRangeStart w:id="52"/>
       <w:r>
         <w:t>Sample size estimation (including clinical significance)</w:t>
       </w:r>
@@ -8725,7 +8516,7 @@
       <w:r>
         <w:instrText xml:space="preserve"> TC "</w:instrText>
       </w:r>
-      <w:bookmarkStart w:id="52" w:name="_Toc183094429"/>
+      <w:bookmarkStart w:id="53" w:name="_Toc183094429"/>
       <w:r>
         <w:instrText>1.8</w:instrText>
       </w:r>
@@ -8733,42 +8524,189 @@
         <w:tab/>
         <w:instrText>Sample size estimation (including clinical significance)</w:instrText>
       </w:r>
-      <w:bookmarkEnd w:id="52"/>
+      <w:bookmarkEnd w:id="53"/>
       <w:r>
         <w:instrText xml:space="preserve">" \f C \l "1" </w:instrText>
       </w:r>
       <w:r>
         <w:fldChar w:fldCharType="end"/>
       </w:r>
-    </w:p>
-    <w:p>
-      <w:pPr>
-        <w:rPr>
-          <w:i/>
-          <w:iCs/>
-        </w:rPr>
-      </w:pPr>
-      <w:r>
-        <w:rPr>
-          <w:i/>
-          <w:iCs/>
+      <w:commentRangeEnd w:id="52"/>
+      <w:r>
+        <w:rPr>
+          <w:rStyle w:val="CommentReference"/>
+          <w:b w:val="0"/>
+          <w:iCs w:val="0"/>
+          <w:u w:val="none"/>
+          <w:lang w:val="en-US"/>
+        </w:rPr>
+        <w:commentReference w:id="52"/>
+      </w:r>
+    </w:p>
+    <w:p>
+      <w:pPr>
+        <w:rPr>
+          <w:i/>
+          <w:iCs/>
+        </w:rPr>
+      </w:pPr>
+      <w:r>
+        <w:rPr>
+          <w:i/>
+          <w:iCs/>
+        </w:rPr>
+        <w:t>{{sample_size}}</w:t>
+      </w:r>
+    </w:p>
+    <w:p>
+      <w:pPr>
+        <w:rPr>
+          <w:i/>
+          <w:iCs/>
+        </w:rPr>
+      </w:pPr>
+    </w:p>
+    <w:p>
+      <w:pPr>
+        <w:pStyle w:val="Heading2"/>
+      </w:pPr>
+      <w:bookmarkStart w:id="54" w:name="_Toc185323539"/>
+      <w:bookmarkStart w:id="55" w:name="_Toc183099248"/>
+      <w:r>
+        <w:t>Brief description</w:t>
+      </w:r>
+      <w:r>
+        <w:t xml:space="preserve"> and timing</w:t>
+      </w:r>
+      <w:r>
+        <w:t xml:space="preserve"> of proposed analyses</w:t>
+      </w:r>
+      <w:bookmarkEnd w:id="54"/>
+      <w:r>
+        <w:t xml:space="preserve"> </w:t>
+      </w:r>
+      <w:bookmarkEnd w:id="55"/>
+    </w:p>
+    <w:p>
+      <w:pPr>
+        <w:rPr>
+          <w:i/>
+          <w:iCs/>
+          <w:sz w:val="22"/>
+          <w:szCs w:val="22"/>
+        </w:rPr>
+      </w:pPr>
+      <w:r>
+        <w:rPr>
+          <w:i/>
+          <w:iCs/>
+          <w:sz w:val="22"/>
+          <w:szCs w:val="22"/>
           <w:highlight w:val="yellow"/>
         </w:rPr>
-        <w:t xml:space="preserve">Full details of the sample size calculation or reference to sample size calculation </w:t>
-      </w:r>
-      <w:r>
-        <w:rPr>
-          <w:i/>
-          <w:iCs/>
+        <w:t>State timing of final analyses</w:t>
+      </w:r>
+      <w:r>
+        <w:rPr>
+          <w:i/>
+          <w:iCs/>
+          <w:sz w:val="22"/>
+          <w:szCs w:val="22"/>
           <w:highlight w:val="yellow"/>
         </w:rPr>
-        <w:t>in the protocol or other document should be included here.</w:t>
-      </w:r>
-      <w:r>
-        <w:rPr>
-          <w:i/>
-          <w:iCs/>
-        </w:rPr>
+        <w:t xml:space="preserve"> as well as any interim analys</w:t>
+      </w:r>
+      <w:r>
+        <w:rPr>
+          <w:i/>
+          <w:iCs/>
+          <w:sz w:val="22"/>
+          <w:szCs w:val="22"/>
+          <w:highlight w:val="yellow"/>
+        </w:rPr>
+        <w:t>es</w:t>
+      </w:r>
+      <w:r>
+        <w:rPr>
+          <w:i/>
+          <w:iCs/>
+          <w:sz w:val="22"/>
+          <w:szCs w:val="22"/>
+          <w:highlight w:val="yellow"/>
+        </w:rPr>
+        <w:t xml:space="preserve"> (</w:t>
+      </w:r>
+      <w:r>
+        <w:rPr>
+          <w:i/>
+          <w:iCs/>
+          <w:sz w:val="22"/>
+          <w:szCs w:val="22"/>
+          <w:highlight w:val="yellow"/>
+        </w:rPr>
+        <w:t>including stopping rules</w:t>
+      </w:r>
+      <w:r>
+        <w:rPr>
+          <w:i/>
+          <w:iCs/>
+          <w:sz w:val="22"/>
+          <w:szCs w:val="22"/>
+          <w:highlight w:val="yellow"/>
+        </w:rPr>
+        <w:t xml:space="preserve"> and any guidelines</w:t>
+      </w:r>
+      <w:r>
+        <w:rPr>
+          <w:i/>
+          <w:iCs/>
+          <w:sz w:val="22"/>
+          <w:szCs w:val="22"/>
+          <w:highlight w:val="yellow"/>
+        </w:rPr>
+        <w:t>)</w:t>
+      </w:r>
+      <w:r>
+        <w:rPr>
+          <w:i/>
+          <w:iCs/>
+          <w:sz w:val="22"/>
+          <w:szCs w:val="22"/>
+          <w:highlight w:val="yellow"/>
+        </w:rPr>
+        <w:t xml:space="preserve"> and who will carry out each analysis. </w:t>
+      </w:r>
+      <w:r>
+        <w:rPr>
+          <w:i/>
+          <w:iCs/>
+          <w:sz w:val="22"/>
+          <w:szCs w:val="22"/>
+          <w:highlight w:val="yellow"/>
+        </w:rPr>
+        <w:t xml:space="preserve">If separate SAPs have been written for interim </w:t>
+      </w:r>
+      <w:r>
+        <w:rPr>
+          <w:i/>
+          <w:iCs/>
+          <w:sz w:val="22"/>
+          <w:szCs w:val="22"/>
+          <w:highlight w:val="yellow"/>
+        </w:rPr>
+        <w:t>analyses,</w:t>
+      </w:r>
+      <w:r>
+        <w:rPr>
+          <w:i/>
+          <w:iCs/>
+          <w:sz w:val="22"/>
+          <w:szCs w:val="22"/>
+          <w:highlight w:val="yellow"/>
+        </w:rPr>
+        <w:t xml:space="preserve"> then these should be referenced.</w:t>
+      </w:r>
+      <w:r>
         <w:t xml:space="preserve"> </w:t>
       </w:r>
       <w:r>
@@ -8777,7 +8715,7 @@
           <w:iCs/>
           <w:highlight w:val="yellow"/>
         </w:rPr>
-        <w:t xml:space="preserve">Consider including </w:t>
+        <w:t>Any planned adjustment of the significance level due to interim analysis should also be outlined here.</w:t>
       </w:r>
       <w:r>
         <w:rPr>
@@ -8785,228 +8723,6 @@
           <w:iCs/>
           <w:highlight w:val="yellow"/>
         </w:rPr>
-        <w:t xml:space="preserve">the </w:t>
-      </w:r>
-      <w:r>
-        <w:rPr>
-          <w:i/>
-          <w:iCs/>
-          <w:highlight w:val="yellow"/>
-        </w:rPr>
-        <w:t>code</w:t>
-      </w:r>
-      <w:r>
-        <w:rPr>
-          <w:i/>
-          <w:iCs/>
-          <w:highlight w:val="yellow"/>
-        </w:rPr>
-        <w:t xml:space="preserve"> used for the sample size calculation</w:t>
-      </w:r>
-      <w:r>
-        <w:rPr>
-          <w:i/>
-          <w:iCs/>
-          <w:highlight w:val="yellow"/>
-        </w:rPr>
-        <w:t xml:space="preserve"> as an appendix </w:t>
-      </w:r>
-      <w:r>
-        <w:rPr>
-          <w:i/>
-          <w:iCs/>
-          <w:highlight w:val="yellow"/>
-        </w:rPr>
-        <w:t>to this document if sample size calculation was complex.</w:t>
-      </w:r>
-      <w:r>
-        <w:rPr>
-          <w:i/>
-          <w:iCs/>
-        </w:rPr>
-        <w:t xml:space="preserve"> </w:t>
-      </w:r>
-    </w:p>
-    <w:p>
-      <w:pPr>
-        <w:rPr>
-          <w:i/>
-          <w:iCs/>
-        </w:rPr>
-      </w:pPr>
-      <w:r>
-        <w:rPr>
-          <w:i/>
-          <w:iCs/>
-        </w:rPr>
-        <w:t>{{sample_size}}</w:t>
-      </w:r>
-    </w:p>
-    <w:p>
-      <w:pPr>
-        <w:rPr>
-          <w:i/>
-          <w:iCs/>
-        </w:rPr>
-      </w:pPr>
-    </w:p>
-    <w:p>
-      <w:pPr>
-        <w:pStyle w:val="Heading2"/>
-      </w:pPr>
-      <w:bookmarkStart w:id="53" w:name="_Toc185323539"/>
-      <w:bookmarkStart w:id="54" w:name="_Toc183099248"/>
-      <w:r>
-        <w:t>Brief description</w:t>
-      </w:r>
-      <w:r>
-        <w:t xml:space="preserve"> and timing</w:t>
-      </w:r>
-      <w:r>
-        <w:t xml:space="preserve"> of proposed analyses</w:t>
-      </w:r>
-      <w:bookmarkEnd w:id="53"/>
-      <w:r>
-        <w:t xml:space="preserve"> </w:t>
-      </w:r>
-      <w:bookmarkEnd w:id="54"/>
-    </w:p>
-    <w:p>
-      <w:pPr>
-        <w:rPr>
-          <w:i/>
-          <w:iCs/>
-          <w:sz w:val="22"/>
-          <w:szCs w:val="22"/>
-        </w:rPr>
-      </w:pPr>
-      <w:r>
-        <w:rPr>
-          <w:i/>
-          <w:iCs/>
-          <w:sz w:val="22"/>
-          <w:szCs w:val="22"/>
-          <w:highlight w:val="yellow"/>
-        </w:rPr>
-        <w:t>State timing of final analyses</w:t>
-      </w:r>
-      <w:r>
-        <w:rPr>
-          <w:i/>
-          <w:iCs/>
-          <w:sz w:val="22"/>
-          <w:szCs w:val="22"/>
-          <w:highlight w:val="yellow"/>
-        </w:rPr>
-        <w:t xml:space="preserve"> as well as any interim analys</w:t>
-      </w:r>
-      <w:r>
-        <w:rPr>
-          <w:i/>
-          <w:iCs/>
-          <w:sz w:val="22"/>
-          <w:szCs w:val="22"/>
-          <w:highlight w:val="yellow"/>
-        </w:rPr>
-        <w:t>es</w:t>
-      </w:r>
-      <w:r>
-        <w:rPr>
-          <w:i/>
-          <w:iCs/>
-          <w:sz w:val="22"/>
-          <w:szCs w:val="22"/>
-          <w:highlight w:val="yellow"/>
-        </w:rPr>
-        <w:t xml:space="preserve"> (</w:t>
-      </w:r>
-      <w:r>
-        <w:rPr>
-          <w:i/>
-          <w:iCs/>
-          <w:sz w:val="22"/>
-          <w:szCs w:val="22"/>
-          <w:highlight w:val="yellow"/>
-        </w:rPr>
-        <w:t>including stopping rules</w:t>
-      </w:r>
-      <w:r>
-        <w:rPr>
-          <w:i/>
-          <w:iCs/>
-          <w:sz w:val="22"/>
-          <w:szCs w:val="22"/>
-          <w:highlight w:val="yellow"/>
-        </w:rPr>
-        <w:t xml:space="preserve"> and any guidelines</w:t>
-      </w:r>
-      <w:r>
-        <w:rPr>
-          <w:i/>
-          <w:iCs/>
-          <w:sz w:val="22"/>
-          <w:szCs w:val="22"/>
-          <w:highlight w:val="yellow"/>
-        </w:rPr>
-        <w:t>)</w:t>
-      </w:r>
-      <w:r>
-        <w:rPr>
-          <w:i/>
-          <w:iCs/>
-          <w:sz w:val="22"/>
-          <w:szCs w:val="22"/>
-          <w:highlight w:val="yellow"/>
-        </w:rPr>
-        <w:t xml:space="preserve"> and who will carry out each analysis. </w:t>
-      </w:r>
-      <w:r>
-        <w:rPr>
-          <w:i/>
-          <w:iCs/>
-          <w:sz w:val="22"/>
-          <w:szCs w:val="22"/>
-          <w:highlight w:val="yellow"/>
-        </w:rPr>
-        <w:t xml:space="preserve">If separate SAPs have been written for interim </w:t>
-      </w:r>
-      <w:r>
-        <w:rPr>
-          <w:i/>
-          <w:iCs/>
-          <w:sz w:val="22"/>
-          <w:szCs w:val="22"/>
-          <w:highlight w:val="yellow"/>
-        </w:rPr>
-        <w:t>analyses,</w:t>
-      </w:r>
-      <w:r>
-        <w:rPr>
-          <w:i/>
-          <w:iCs/>
-          <w:sz w:val="22"/>
-          <w:szCs w:val="22"/>
-          <w:highlight w:val="yellow"/>
-        </w:rPr>
-        <w:t xml:space="preserve"> then these should be referenced.</w:t>
-      </w:r>
-      <w:r>
-        <w:t xml:space="preserve"> </w:t>
-      </w:r>
-      <w:r>
-        <w:rPr>
-          <w:i/>
-          <w:iCs/>
-          <w:highlight w:val="yellow"/>
-        </w:rPr>
-        <w:t>Any planned adjustment of the significance level due to interim analysis should also be outlined here.</w:t>
-      </w:r>
-      <w:r>
-        <w:rPr>
-          <w:i/>
-          <w:iCs/>
-          <w:highlight w:val="yellow"/>
-        </w:rPr>
         <w:t xml:space="preserve"> If further details included in DMC charter, this should also be referenced here.</w:t>
       </w:r>
     </w:p>
@@ -9036,24 +8752,14 @@
           <w:sz w:val="22"/>
           <w:szCs w:val="22"/>
         </w:rPr>
-        <w:t xml:space="preserve">Analyses will be carried out by the trial statistician </w:t>
-      </w:r>
-      <w:r>
-        <w:rPr>
-          <w:i/>
-          <w:iCs/>
-          <w:sz w:val="22"/>
-          <w:szCs w:val="22"/>
-          <w:highlight w:val="yellow"/>
-        </w:rPr>
-        <w:t>(state who if more than one).</w:t>
-      </w:r>
-      <w:r>
-        <w:rPr>
-          <w:sz w:val="22"/>
-          <w:szCs w:val="22"/>
-        </w:rPr>
-        <w:t xml:space="preserve">  </w:t>
+        <w:t>Analyses will be carried out by the trial statistician</w:t>
+      </w:r>
+      <w:r>
+        <w:rPr>
+          <w:sz w:val="22"/>
+          <w:szCs w:val="22"/>
+        </w:rPr>
+        <w:t>.</w:t>
       </w:r>
     </w:p>
     <w:p>
@@ -9097,46 +8803,45 @@
       <w:pPr>
         <w:pStyle w:val="Heading1"/>
       </w:pPr>
-      <w:bookmarkStart w:id="55" w:name="_Toc185323540"/>
-      <w:bookmarkStart w:id="56" w:name="_Toc185323541"/>
-      <w:bookmarkStart w:id="57" w:name="_Toc183095012"/>
-      <w:bookmarkStart w:id="58" w:name="_Toc183095118"/>
-      <w:bookmarkStart w:id="59" w:name="_Toc183095463"/>
-      <w:bookmarkStart w:id="60" w:name="_Toc183099249"/>
-      <w:bookmarkStart w:id="61" w:name="_Toc183100540"/>
-      <w:bookmarkStart w:id="62" w:name="_Toc183095013"/>
-      <w:bookmarkStart w:id="63" w:name="_Toc183095119"/>
-      <w:bookmarkStart w:id="64" w:name="_Toc183095464"/>
-      <w:bookmarkStart w:id="65" w:name="_Toc183099250"/>
-      <w:bookmarkStart w:id="66" w:name="_Toc183100541"/>
-      <w:bookmarkStart w:id="67" w:name="_Toc183095014"/>
-      <w:bookmarkStart w:id="68" w:name="_Toc183095120"/>
-      <w:bookmarkStart w:id="69" w:name="_Toc183095465"/>
-      <w:bookmarkStart w:id="70" w:name="_Toc183099251"/>
-      <w:bookmarkStart w:id="71" w:name="_Toc183100542"/>
-      <w:bookmarkStart w:id="72" w:name="_Toc183095015"/>
-      <w:bookmarkStart w:id="73" w:name="_Toc183095121"/>
-      <w:bookmarkStart w:id="74" w:name="_Toc183095466"/>
-      <w:bookmarkStart w:id="75" w:name="_Toc183099252"/>
-      <w:bookmarkStart w:id="76" w:name="_Toc183100543"/>
-      <w:bookmarkStart w:id="77" w:name="_Toc183095016"/>
-      <w:bookmarkStart w:id="78" w:name="_Toc183095122"/>
-      <w:bookmarkStart w:id="79" w:name="_Toc183095467"/>
-      <w:bookmarkStart w:id="80" w:name="_Toc183099253"/>
-      <w:bookmarkStart w:id="81" w:name="_Toc183100544"/>
-      <w:bookmarkStart w:id="82" w:name="_Toc183095017"/>
-      <w:bookmarkStart w:id="83" w:name="_Toc183095123"/>
-      <w:bookmarkStart w:id="84" w:name="_Toc183095468"/>
-      <w:bookmarkStart w:id="85" w:name="_Toc183099254"/>
-      <w:bookmarkStart w:id="86" w:name="_Toc183100545"/>
-      <w:bookmarkStart w:id="87" w:name="_Toc183095018"/>
-      <w:bookmarkStart w:id="88" w:name="_Toc183095124"/>
-      <w:bookmarkStart w:id="89" w:name="_Toc183095469"/>
-      <w:bookmarkStart w:id="90" w:name="_Toc183099255"/>
-      <w:bookmarkStart w:id="91" w:name="_Toc183100546"/>
-      <w:bookmarkStart w:id="92" w:name="_Toc183099256"/>
-      <w:bookmarkStart w:id="93" w:name="_Toc185323542"/>
-      <w:bookmarkEnd w:id="55"/>
+      <w:bookmarkStart w:id="56" w:name="_Toc185323540"/>
+      <w:bookmarkStart w:id="57" w:name="_Toc185323541"/>
+      <w:bookmarkStart w:id="58" w:name="_Toc183095012"/>
+      <w:bookmarkStart w:id="59" w:name="_Toc183095118"/>
+      <w:bookmarkStart w:id="60" w:name="_Toc183095463"/>
+      <w:bookmarkStart w:id="61" w:name="_Toc183099249"/>
+      <w:bookmarkStart w:id="62" w:name="_Toc183100540"/>
+      <w:bookmarkStart w:id="63" w:name="_Toc183095013"/>
+      <w:bookmarkStart w:id="64" w:name="_Toc183095119"/>
+      <w:bookmarkStart w:id="65" w:name="_Toc183095464"/>
+      <w:bookmarkStart w:id="66" w:name="_Toc183099250"/>
+      <w:bookmarkStart w:id="67" w:name="_Toc183100541"/>
+      <w:bookmarkStart w:id="68" w:name="_Toc183095014"/>
+      <w:bookmarkStart w:id="69" w:name="_Toc183095120"/>
+      <w:bookmarkStart w:id="70" w:name="_Toc183095465"/>
+      <w:bookmarkStart w:id="71" w:name="_Toc183099251"/>
+      <w:bookmarkStart w:id="72" w:name="_Toc183100542"/>
+      <w:bookmarkStart w:id="73" w:name="_Toc183095015"/>
+      <w:bookmarkStart w:id="74" w:name="_Toc183095121"/>
+      <w:bookmarkStart w:id="75" w:name="_Toc183095466"/>
+      <w:bookmarkStart w:id="76" w:name="_Toc183099252"/>
+      <w:bookmarkStart w:id="77" w:name="_Toc183100543"/>
+      <w:bookmarkStart w:id="78" w:name="_Toc183095016"/>
+      <w:bookmarkStart w:id="79" w:name="_Toc183095122"/>
+      <w:bookmarkStart w:id="80" w:name="_Toc183095467"/>
+      <w:bookmarkStart w:id="81" w:name="_Toc183099253"/>
+      <w:bookmarkStart w:id="82" w:name="_Toc183100544"/>
+      <w:bookmarkStart w:id="83" w:name="_Toc183095017"/>
+      <w:bookmarkStart w:id="84" w:name="_Toc183095123"/>
+      <w:bookmarkStart w:id="85" w:name="_Toc183095468"/>
+      <w:bookmarkStart w:id="86" w:name="_Toc183099254"/>
+      <w:bookmarkStart w:id="87" w:name="_Toc183100545"/>
+      <w:bookmarkStart w:id="88" w:name="_Toc183095018"/>
+      <w:bookmarkStart w:id="89" w:name="_Toc183095124"/>
+      <w:bookmarkStart w:id="90" w:name="_Toc183095469"/>
+      <w:bookmarkStart w:id="91" w:name="_Toc183099255"/>
+      <w:bookmarkStart w:id="92" w:name="_Toc183100546"/>
+      <w:bookmarkStart w:id="93" w:name="_Toc183099256"/>
+      <w:bookmarkStart w:id="94" w:name="_Toc185323542"/>
       <w:bookmarkEnd w:id="56"/>
       <w:bookmarkEnd w:id="57"/>
       <w:bookmarkEnd w:id="58"/>
@@ -9173,18 +8878,19 @@
       <w:bookmarkEnd w:id="89"/>
       <w:bookmarkEnd w:id="90"/>
       <w:bookmarkEnd w:id="91"/>
+      <w:bookmarkEnd w:id="92"/>
       <w:r>
         <w:t>Data analysis plan – Data description</w:t>
       </w:r>
-      <w:bookmarkEnd w:id="92"/>
       <w:bookmarkEnd w:id="93"/>
+      <w:bookmarkEnd w:id="94"/>
       <w:r>
         <w:fldChar w:fldCharType="begin"/>
       </w:r>
       <w:r>
         <w:instrText xml:space="preserve"> TC "</w:instrText>
       </w:r>
-      <w:bookmarkStart w:id="94" w:name="_Toc183094431"/>
+      <w:bookmarkStart w:id="95" w:name="_Toc183094431"/>
       <w:r>
         <w:instrText>2.</w:instrText>
       </w:r>
@@ -9192,7 +8898,7 @@
         <w:tab/>
         <w:instrText>Data analysis plan – Data description</w:instrText>
       </w:r>
-      <w:bookmarkEnd w:id="94"/>
+      <w:bookmarkEnd w:id="95"/>
       <w:r>
         <w:instrText xml:space="preserve">" \f C \l "1" </w:instrText>
       </w:r>
@@ -9204,20 +8910,20 @@
       <w:pPr>
         <w:pStyle w:val="Heading2"/>
       </w:pPr>
-      <w:bookmarkStart w:id="95" w:name="_Toc183099257"/>
-      <w:bookmarkStart w:id="96" w:name="_Toc185323543"/>
+      <w:bookmarkStart w:id="96" w:name="_Toc183099257"/>
+      <w:bookmarkStart w:id="97" w:name="_Toc185323543"/>
       <w:r>
         <w:t>Recruitment and representativeness of recruited patients</w:t>
       </w:r>
-      <w:bookmarkEnd w:id="95"/>
       <w:bookmarkEnd w:id="96"/>
+      <w:bookmarkEnd w:id="97"/>
       <w:r>
         <w:fldChar w:fldCharType="begin"/>
       </w:r>
       <w:r>
         <w:instrText xml:space="preserve"> TC "</w:instrText>
       </w:r>
-      <w:bookmarkStart w:id="97" w:name="_Toc183094432"/>
+      <w:bookmarkStart w:id="98" w:name="_Toc183094432"/>
       <w:r>
         <w:instrText>2.1</w:instrText>
       </w:r>
@@ -9225,7 +8931,7 @@
         <w:tab/>
         <w:instrText>Recruitment and representativeness of recruited patients</w:instrText>
       </w:r>
-      <w:bookmarkEnd w:id="97"/>
+      <w:bookmarkEnd w:id="98"/>
       <w:r>
         <w:instrText xml:space="preserve">" \f C \l "1" </w:instrText>
       </w:r>
@@ -9372,11 +9078,11 @@
       <w:r>
         <w:instrText xml:space="preserve"> TC "</w:instrText>
       </w:r>
-      <w:bookmarkStart w:id="98" w:name="_Toc183094433"/>
+      <w:bookmarkStart w:id="99" w:name="_Toc183094433"/>
       <w:r>
         <w:instrText>Figure 2.  Template CONSORT diagram for ACRONYM trial</w:instrText>
       </w:r>
-      <w:bookmarkEnd w:id="98"/>
+      <w:bookmarkEnd w:id="99"/>
       <w:r>
         <w:instrText xml:space="preserve">" \f C \l "1" </w:instrText>
       </w:r>
@@ -9395,21 +9101,21 @@
       <w:r>
         <w:br w:type="page"/>
       </w:r>
-      <w:bookmarkStart w:id="99" w:name="_Toc183099258"/>
-      <w:bookmarkStart w:id="100" w:name="_Toc185323544"/>
+      <w:bookmarkStart w:id="100" w:name="_Toc183099258"/>
+      <w:bookmarkStart w:id="101" w:name="_Toc185323544"/>
       <w:r>
         <w:lastRenderedPageBreak/>
         <w:t>Baseline comparability of randomised groups</w:t>
       </w:r>
-      <w:bookmarkEnd w:id="99"/>
       <w:bookmarkEnd w:id="100"/>
+      <w:bookmarkEnd w:id="101"/>
       <w:r>
         <w:fldChar w:fldCharType="begin"/>
       </w:r>
       <w:r>
         <w:instrText xml:space="preserve"> TC "</w:instrText>
       </w:r>
-      <w:bookmarkStart w:id="101" w:name="_Toc183094434"/>
+      <w:bookmarkStart w:id="102" w:name="_Toc183094434"/>
       <w:r>
         <w:instrText>2.2</w:instrText>
       </w:r>
@@ -9417,7 +9123,7 @@
         <w:tab/>
         <w:instrText>Baseline comparability of randomised groups</w:instrText>
       </w:r>
-      <w:bookmarkEnd w:id="101"/>
+      <w:bookmarkEnd w:id="102"/>
       <w:r>
         <w:instrText xml:space="preserve">" \f C \l "1" </w:instrText>
       </w:r>
@@ -9447,15 +9153,15 @@
       <w:pPr>
         <w:pStyle w:val="Heading2"/>
       </w:pPr>
-      <w:bookmarkStart w:id="102" w:name="_Toc185323545"/>
-      <w:bookmarkStart w:id="103" w:name="_Toc183099259"/>
-      <w:bookmarkStart w:id="104" w:name="_Toc185323546"/>
-      <w:bookmarkEnd w:id="102"/>
+      <w:bookmarkStart w:id="103" w:name="_Toc185323545"/>
+      <w:bookmarkStart w:id="104" w:name="_Toc183099259"/>
+      <w:bookmarkStart w:id="105" w:name="_Toc185323546"/>
+      <w:bookmarkEnd w:id="103"/>
       <w:r>
         <w:t>Adherence to allocated treatment and treatment fidelity</w:t>
       </w:r>
-      <w:bookmarkEnd w:id="103"/>
       <w:bookmarkEnd w:id="104"/>
+      <w:bookmarkEnd w:id="105"/>
     </w:p>
     <w:p>
       <w:pPr>
@@ -9489,7 +9195,7 @@
           <w:szCs w:val="22"/>
         </w:rPr>
       </w:pPr>
-      <w:commentRangeStart w:id="105"/>
+      <w:commentRangeStart w:id="106"/>
       <w:r>
         <w:rPr>
           <w:sz w:val="22"/>
@@ -9497,12 +9203,12 @@
         </w:rPr>
         <w:t>treatment_compliance_definitition</w:t>
       </w:r>
-      <w:commentRangeEnd w:id="105"/>
+      <w:commentRangeEnd w:id="106"/>
       <w:r>
         <w:rPr>
           <w:rStyle w:val="CommentReference"/>
         </w:rPr>
-        <w:commentReference w:id="105"/>
+        <w:commentReference w:id="106"/>
       </w:r>
       <w:r>
         <w:rPr>
@@ -9533,7 +9239,7 @@
       <w:r>
         <w:instrText xml:space="preserve"> TC "</w:instrText>
       </w:r>
-      <w:bookmarkStart w:id="106" w:name="_Toc183094435"/>
+      <w:bookmarkStart w:id="107" w:name="_Toc183094435"/>
       <w:r>
         <w:instrText>2.3</w:instrText>
       </w:r>
@@ -9541,7 +9247,7 @@
         <w:tab/>
         <w:instrText>Adherence to allocated treatment and treatment fidelity</w:instrText>
       </w:r>
-      <w:bookmarkEnd w:id="106"/>
+      <w:bookmarkEnd w:id="107"/>
       <w:r>
         <w:instrText xml:space="preserve">" \f C \l "1" </w:instrText>
       </w:r>
@@ -9569,18 +9275,18 @@
       <w:pPr>
         <w:pStyle w:val="Heading2"/>
       </w:pPr>
-      <w:bookmarkStart w:id="107" w:name="_Toc183099260"/>
-      <w:bookmarkStart w:id="108" w:name="_Toc185323547"/>
+      <w:bookmarkStart w:id="108" w:name="_Toc183099260"/>
+      <w:bookmarkStart w:id="109" w:name="_Toc185323547"/>
       <w:r>
         <w:t xml:space="preserve">Loss to follow-up and other missing </w:t>
       </w:r>
-      <w:commentRangeStart w:id="109"/>
+      <w:commentRangeStart w:id="110"/>
       <w:r>
         <w:t>data</w:t>
       </w:r>
-      <w:bookmarkEnd w:id="107"/>
       <w:bookmarkEnd w:id="108"/>
-      <w:commentRangeEnd w:id="109"/>
+      <w:bookmarkEnd w:id="109"/>
+      <w:commentRangeEnd w:id="110"/>
       <w:r>
         <w:rPr>
           <w:rStyle w:val="CommentReference"/>
@@ -9589,7 +9295,7 @@
           <w:u w:val="none"/>
           <w:lang w:val="en-US"/>
         </w:rPr>
-        <w:commentReference w:id="109"/>
+        <w:commentReference w:id="110"/>
       </w:r>
       <w:r>
         <w:fldChar w:fldCharType="begin"/>
@@ -9597,7 +9303,7 @@
       <w:r>
         <w:instrText xml:space="preserve"> TC "</w:instrText>
       </w:r>
-      <w:bookmarkStart w:id="110" w:name="_Toc183094436"/>
+      <w:bookmarkStart w:id="111" w:name="_Toc183094436"/>
       <w:r>
         <w:instrText>2.4</w:instrText>
       </w:r>
@@ -9605,7 +9311,7 @@
         <w:tab/>
         <w:instrText>Loss to follow-up and other missing data</w:instrText>
       </w:r>
-      <w:bookmarkEnd w:id="110"/>
+      <w:bookmarkEnd w:id="111"/>
       <w:r>
         <w:instrText xml:space="preserve">" \f C \l "1" </w:instrText>
       </w:r>
@@ -9641,11 +9347,11 @@
       <w:pPr>
         <w:pStyle w:val="Heading2"/>
       </w:pPr>
-      <w:bookmarkStart w:id="111" w:name="_Toc185323548"/>
+      <w:bookmarkStart w:id="112" w:name="_Toc185323548"/>
       <w:r>
         <w:t>Harms</w:t>
       </w:r>
-      <w:bookmarkEnd w:id="111"/>
+      <w:bookmarkEnd w:id="112"/>
     </w:p>
     <w:p>
       <w:pPr>
@@ -9790,7 +9496,7 @@
         </w:rPr>
         <w:t>{{adverse_</w:t>
       </w:r>
-      <w:commentRangeStart w:id="112"/>
+      <w:commentRangeStart w:id="113"/>
       <w:r>
         <w:rPr>
           <w:highlight w:val="red"/>
@@ -9798,13 +9504,13 @@
         </w:rPr>
         <w:t>events</w:t>
       </w:r>
-      <w:commentRangeEnd w:id="112"/>
+      <w:commentRangeEnd w:id="113"/>
       <w:r>
         <w:rPr>
           <w:rStyle w:val="CommentReference"/>
           <w:rtl/>
         </w:rPr>
-        <w:commentReference w:id="112"/>
+        <w:commentReference w:id="113"/>
       </w:r>
       <w:r>
         <w:rPr>
@@ -9834,22 +9540,22 @@
       <w:pPr>
         <w:pStyle w:val="Heading2"/>
       </w:pPr>
-      <w:bookmarkStart w:id="113" w:name="_Toc185323549"/>
-      <w:bookmarkStart w:id="114" w:name="_Toc185323550"/>
-      <w:bookmarkStart w:id="115" w:name="_Toc185323551"/>
-      <w:bookmarkStart w:id="116" w:name="_Toc183099262"/>
-      <w:bookmarkStart w:id="117" w:name="_Toc185323552"/>
-      <w:bookmarkEnd w:id="113"/>
+      <w:bookmarkStart w:id="114" w:name="_Toc185323549"/>
+      <w:bookmarkStart w:id="115" w:name="_Toc185323550"/>
+      <w:bookmarkStart w:id="116" w:name="_Toc185323551"/>
+      <w:bookmarkStart w:id="117" w:name="_Toc183099262"/>
+      <w:bookmarkStart w:id="118" w:name="_Toc185323552"/>
       <w:bookmarkEnd w:id="114"/>
       <w:bookmarkEnd w:id="115"/>
+      <w:bookmarkEnd w:id="116"/>
       <w:r>
         <w:t>Assessment of outcome measures (</w:t>
       </w:r>
-      <w:commentRangeStart w:id="118"/>
+      <w:commentRangeStart w:id="119"/>
       <w:r>
         <w:t>unblinding</w:t>
       </w:r>
-      <w:commentRangeEnd w:id="118"/>
+      <w:commentRangeEnd w:id="119"/>
       <w:r>
         <w:rPr>
           <w:rStyle w:val="CommentReference"/>
@@ -9858,20 +9564,20 @@
           <w:u w:val="none"/>
           <w:lang w:val="en-US"/>
         </w:rPr>
-        <w:commentReference w:id="118"/>
+        <w:commentReference w:id="119"/>
       </w:r>
       <w:r>
         <w:t>)</w:t>
       </w:r>
-      <w:bookmarkEnd w:id="116"/>
       <w:bookmarkEnd w:id="117"/>
+      <w:bookmarkEnd w:id="118"/>
       <w:r>
         <w:fldChar w:fldCharType="begin"/>
       </w:r>
       <w:r>
         <w:instrText xml:space="preserve"> TC "</w:instrText>
       </w:r>
-      <w:bookmarkStart w:id="119" w:name="_Toc183094438"/>
+      <w:bookmarkStart w:id="120" w:name="_Toc183094438"/>
       <w:r>
         <w:instrText>2.6</w:instrText>
       </w:r>
@@ -9879,7 +9585,7 @@
         <w:tab/>
         <w:instrText>Assessment of outcome measures (unblinding)</w:instrText>
       </w:r>
-      <w:bookmarkEnd w:id="119"/>
+      <w:bookmarkEnd w:id="120"/>
       <w:r>
         <w:instrText xml:space="preserve">" \f C \l "1" </w:instrText>
       </w:r>
@@ -9897,21 +9603,21 @@
       <w:pPr>
         <w:pStyle w:val="Heading2"/>
       </w:pPr>
-      <w:bookmarkStart w:id="120" w:name="_Toc183099263"/>
-      <w:bookmarkStart w:id="121" w:name="_Toc185323553"/>
+      <w:bookmarkStart w:id="121" w:name="_Toc183099263"/>
+      <w:bookmarkStart w:id="122" w:name="_Toc185323553"/>
       <w:r>
         <w:lastRenderedPageBreak/>
         <w:t>Descriptive statistics for outcome measures</w:t>
       </w:r>
-      <w:bookmarkEnd w:id="120"/>
       <w:bookmarkEnd w:id="121"/>
+      <w:bookmarkEnd w:id="122"/>
       <w:r>
         <w:fldChar w:fldCharType="begin"/>
       </w:r>
       <w:r>
         <w:instrText xml:space="preserve"> TC "</w:instrText>
       </w:r>
-      <w:bookmarkStart w:id="122" w:name="_Toc183094439"/>
+      <w:bookmarkStart w:id="123" w:name="_Toc183094439"/>
       <w:r>
         <w:instrText>2.7</w:instrText>
       </w:r>
@@ -9919,7 +9625,7 @@
         <w:tab/>
         <w:instrText>Descriptive statistics for outcome measures</w:instrText>
       </w:r>
-      <w:bookmarkEnd w:id="122"/>
+      <w:bookmarkEnd w:id="123"/>
       <w:r>
         <w:instrText xml:space="preserve">" \f C \l "1" </w:instrText>
       </w:r>
@@ -9953,18 +9659,18 @@
       <w:pPr>
         <w:pStyle w:val="Heading2"/>
       </w:pPr>
-      <w:bookmarkStart w:id="123" w:name="_Toc185323554"/>
-      <w:bookmarkStart w:id="124" w:name="_Toc183099264"/>
-      <w:bookmarkStart w:id="125" w:name="_Toc185323555"/>
-      <w:bookmarkEnd w:id="123"/>
+      <w:bookmarkStart w:id="124" w:name="_Toc185323554"/>
+      <w:bookmarkStart w:id="125" w:name="_Toc183099264"/>
+      <w:bookmarkStart w:id="126" w:name="_Toc185323555"/>
+      <w:bookmarkEnd w:id="124"/>
       <w:r>
         <w:t>Descripti</w:t>
       </w:r>
       <w:r>
         <w:t>ves</w:t>
       </w:r>
-      <w:bookmarkEnd w:id="124"/>
       <w:bookmarkEnd w:id="125"/>
+      <w:bookmarkEnd w:id="126"/>
       <w:r>
         <w:t xml:space="preserve"> of </w:t>
       </w:r>
@@ -10164,13 +9870,13 @@
       <w:pPr>
         <w:pStyle w:val="Heading2"/>
       </w:pPr>
-      <w:bookmarkStart w:id="126" w:name="_Toc183099265"/>
-      <w:bookmarkStart w:id="127" w:name="_Toc185323556"/>
+      <w:bookmarkStart w:id="127" w:name="_Toc183099265"/>
+      <w:bookmarkStart w:id="128" w:name="_Toc185323556"/>
       <w:r>
         <w:t>Protocol deviations/violations</w:t>
       </w:r>
-      <w:bookmarkEnd w:id="126"/>
       <w:bookmarkEnd w:id="127"/>
+      <w:bookmarkEnd w:id="128"/>
     </w:p>
     <w:p>
       <w:pPr>
@@ -10344,44 +10050,43 @@
       <w:pPr>
         <w:pStyle w:val="Heading1"/>
       </w:pPr>
-      <w:bookmarkStart w:id="128" w:name="_Toc183095029"/>
-      <w:bookmarkStart w:id="129" w:name="_Toc183095135"/>
-      <w:bookmarkStart w:id="130" w:name="_Toc183095480"/>
-      <w:bookmarkStart w:id="131" w:name="_Toc183099266"/>
-      <w:bookmarkStart w:id="132" w:name="_Toc183100557"/>
-      <w:bookmarkStart w:id="133" w:name="_Toc183095030"/>
-      <w:bookmarkStart w:id="134" w:name="_Toc183095136"/>
-      <w:bookmarkStart w:id="135" w:name="_Toc183095481"/>
-      <w:bookmarkStart w:id="136" w:name="_Toc183099267"/>
-      <w:bookmarkStart w:id="137" w:name="_Toc183100558"/>
-      <w:bookmarkStart w:id="138" w:name="_Toc183095031"/>
-      <w:bookmarkStart w:id="139" w:name="_Toc183095137"/>
-      <w:bookmarkStart w:id="140" w:name="_Toc183095482"/>
-      <w:bookmarkStart w:id="141" w:name="_Toc183099268"/>
-      <w:bookmarkStart w:id="142" w:name="_Toc183100559"/>
-      <w:bookmarkStart w:id="143" w:name="_Toc183095032"/>
-      <w:bookmarkStart w:id="144" w:name="_Toc183095138"/>
-      <w:bookmarkStart w:id="145" w:name="_Toc183095483"/>
-      <w:bookmarkStart w:id="146" w:name="_Toc183099269"/>
-      <w:bookmarkStart w:id="147" w:name="_Toc183100560"/>
-      <w:bookmarkStart w:id="148" w:name="_Toc183095033"/>
-      <w:bookmarkStart w:id="149" w:name="_Toc183095139"/>
-      <w:bookmarkStart w:id="150" w:name="_Toc183095484"/>
-      <w:bookmarkStart w:id="151" w:name="_Toc183099270"/>
-      <w:bookmarkStart w:id="152" w:name="_Toc183100561"/>
-      <w:bookmarkStart w:id="153" w:name="_Toc183095034"/>
-      <w:bookmarkStart w:id="154" w:name="_Toc183095140"/>
-      <w:bookmarkStart w:id="155" w:name="_Toc183095485"/>
-      <w:bookmarkStart w:id="156" w:name="_Toc183099271"/>
-      <w:bookmarkStart w:id="157" w:name="_Toc183100562"/>
-      <w:bookmarkStart w:id="158" w:name="_Toc183095035"/>
-      <w:bookmarkStart w:id="159" w:name="_Toc183095141"/>
-      <w:bookmarkStart w:id="160" w:name="_Toc183095486"/>
-      <w:bookmarkStart w:id="161" w:name="_Toc183099272"/>
-      <w:bookmarkStart w:id="162" w:name="_Toc183100563"/>
-      <w:bookmarkStart w:id="163" w:name="_Toc183099273"/>
-      <w:bookmarkStart w:id="164" w:name="_Toc185323557"/>
-      <w:bookmarkEnd w:id="128"/>
+      <w:bookmarkStart w:id="129" w:name="_Toc183095029"/>
+      <w:bookmarkStart w:id="130" w:name="_Toc183095135"/>
+      <w:bookmarkStart w:id="131" w:name="_Toc183095480"/>
+      <w:bookmarkStart w:id="132" w:name="_Toc183099266"/>
+      <w:bookmarkStart w:id="133" w:name="_Toc183100557"/>
+      <w:bookmarkStart w:id="134" w:name="_Toc183095030"/>
+      <w:bookmarkStart w:id="135" w:name="_Toc183095136"/>
+      <w:bookmarkStart w:id="136" w:name="_Toc183095481"/>
+      <w:bookmarkStart w:id="137" w:name="_Toc183099267"/>
+      <w:bookmarkStart w:id="138" w:name="_Toc183100558"/>
+      <w:bookmarkStart w:id="139" w:name="_Toc183095031"/>
+      <w:bookmarkStart w:id="140" w:name="_Toc183095137"/>
+      <w:bookmarkStart w:id="141" w:name="_Toc183095482"/>
+      <w:bookmarkStart w:id="142" w:name="_Toc183099268"/>
+      <w:bookmarkStart w:id="143" w:name="_Toc183100559"/>
+      <w:bookmarkStart w:id="144" w:name="_Toc183095032"/>
+      <w:bookmarkStart w:id="145" w:name="_Toc183095138"/>
+      <w:bookmarkStart w:id="146" w:name="_Toc183095483"/>
+      <w:bookmarkStart w:id="147" w:name="_Toc183099269"/>
+      <w:bookmarkStart w:id="148" w:name="_Toc183100560"/>
+      <w:bookmarkStart w:id="149" w:name="_Toc183095033"/>
+      <w:bookmarkStart w:id="150" w:name="_Toc183095139"/>
+      <w:bookmarkStart w:id="151" w:name="_Toc183095484"/>
+      <w:bookmarkStart w:id="152" w:name="_Toc183099270"/>
+      <w:bookmarkStart w:id="153" w:name="_Toc183100561"/>
+      <w:bookmarkStart w:id="154" w:name="_Toc183095034"/>
+      <w:bookmarkStart w:id="155" w:name="_Toc183095140"/>
+      <w:bookmarkStart w:id="156" w:name="_Toc183095485"/>
+      <w:bookmarkStart w:id="157" w:name="_Toc183099271"/>
+      <w:bookmarkStart w:id="158" w:name="_Toc183100562"/>
+      <w:bookmarkStart w:id="159" w:name="_Toc183095035"/>
+      <w:bookmarkStart w:id="160" w:name="_Toc183095141"/>
+      <w:bookmarkStart w:id="161" w:name="_Toc183095486"/>
+      <w:bookmarkStart w:id="162" w:name="_Toc183099272"/>
+      <w:bookmarkStart w:id="163" w:name="_Toc183100563"/>
+      <w:bookmarkStart w:id="164" w:name="_Toc183099273"/>
+      <w:bookmarkStart w:id="165" w:name="_Toc185323557"/>
       <w:bookmarkEnd w:id="129"/>
       <w:bookmarkEnd w:id="130"/>
       <w:bookmarkEnd w:id="131"/>
@@ -10416,19 +10121,20 @@
       <w:bookmarkEnd w:id="160"/>
       <w:bookmarkEnd w:id="161"/>
       <w:bookmarkEnd w:id="162"/>
+      <w:bookmarkEnd w:id="163"/>
       <w:r>
         <w:lastRenderedPageBreak/>
         <w:t>Data analysis plan – Inferential analysis</w:t>
       </w:r>
-      <w:bookmarkEnd w:id="163"/>
       <w:bookmarkEnd w:id="164"/>
+      <w:bookmarkEnd w:id="165"/>
       <w:r>
         <w:fldChar w:fldCharType="begin"/>
       </w:r>
       <w:r>
         <w:instrText xml:space="preserve"> TC "</w:instrText>
       </w:r>
-      <w:bookmarkStart w:id="165" w:name="_Toc183094441"/>
+      <w:bookmarkStart w:id="166" w:name="_Toc183094441"/>
       <w:r>
         <w:instrText>3.</w:instrText>
       </w:r>
@@ -10436,7 +10142,7 @@
         <w:tab/>
         <w:instrText>Data analysis plan – Inferential analysis</w:instrText>
       </w:r>
-      <w:bookmarkEnd w:id="165"/>
+      <w:bookmarkEnd w:id="166"/>
       <w:r>
         <w:instrText xml:space="preserve">" \f C \l "1" </w:instrText>
       </w:r>
@@ -10448,13 +10154,13 @@
       <w:pPr>
         <w:pStyle w:val="Heading2"/>
       </w:pPr>
-      <w:bookmarkStart w:id="166" w:name="_Toc183099274"/>
-      <w:bookmarkStart w:id="167" w:name="_Toc185323558"/>
+      <w:bookmarkStart w:id="167" w:name="_Toc183099274"/>
+      <w:bookmarkStart w:id="168" w:name="_Toc185323558"/>
       <w:r>
         <w:t>Description of primary estimand</w:t>
       </w:r>
-      <w:bookmarkEnd w:id="166"/>
       <w:bookmarkEnd w:id="167"/>
+      <w:bookmarkEnd w:id="168"/>
     </w:p>
     <w:p>
       <w:pPr>
@@ -10934,16 +10640,16 @@
       </w:r>
     </w:p>
     <w:p>
-      <w:bookmarkStart w:id="168" w:name="_Toc183099275"/>
-      <w:bookmarkEnd w:id="168"/>
+      <w:bookmarkStart w:id="169" w:name="_Toc183099275"/>
+      <w:bookmarkEnd w:id="169"/>
     </w:p>
     <w:p/>
     <w:p>
       <w:pPr>
         <w:pStyle w:val="Heading2"/>
       </w:pPr>
-      <w:bookmarkStart w:id="169" w:name="_Toc183099276"/>
-      <w:bookmarkStart w:id="170" w:name="_Toc185323559"/>
+      <w:bookmarkStart w:id="170" w:name="_Toc183099276"/>
+      <w:bookmarkStart w:id="171" w:name="_Toc185323559"/>
       <w:r>
         <w:t xml:space="preserve">Analysis </w:t>
       </w:r>
@@ -10956,8 +10662,8 @@
       <w:r>
         <w:t>(s)</w:t>
       </w:r>
-      <w:bookmarkEnd w:id="169"/>
       <w:bookmarkEnd w:id="170"/>
+      <w:bookmarkEnd w:id="171"/>
     </w:p>
     <w:p>
       <w:pPr>
@@ -11062,19 +10768,19 @@
       <w:pPr>
         <w:pStyle w:val="Heading2"/>
       </w:pPr>
-      <w:bookmarkStart w:id="171" w:name="_Ref105410120"/>
-      <w:bookmarkStart w:id="172" w:name="_Toc105411787"/>
-      <w:bookmarkStart w:id="173" w:name="_Toc148432493"/>
-      <w:bookmarkStart w:id="174" w:name="_Toc183099277"/>
-      <w:bookmarkStart w:id="175" w:name="_Toc185323560"/>
+      <w:bookmarkStart w:id="172" w:name="_Ref105410120"/>
+      <w:bookmarkStart w:id="173" w:name="_Toc105411787"/>
+      <w:bookmarkStart w:id="174" w:name="_Toc148432493"/>
+      <w:bookmarkStart w:id="175" w:name="_Toc183099277"/>
+      <w:bookmarkStart w:id="176" w:name="_Toc185323560"/>
       <w:r>
         <w:t>List of anticipated</w:t>
       </w:r>
       <w:r>
         <w:t xml:space="preserve"> intercurrent events</w:t>
       </w:r>
-      <w:bookmarkEnd w:id="171"/>
       <w:bookmarkEnd w:id="172"/>
+      <w:bookmarkEnd w:id="173"/>
       <w:r>
         <w:t xml:space="preserve"> and </w:t>
       </w:r>
@@ -11084,12 +10790,12 @@
       <w:r>
         <w:t>supplementary analyses</w:t>
       </w:r>
-      <w:bookmarkEnd w:id="173"/>
+      <w:bookmarkEnd w:id="174"/>
       <w:r>
         <w:t xml:space="preserve"> using different strategies</w:t>
       </w:r>
-      <w:bookmarkEnd w:id="174"/>
       <w:bookmarkEnd w:id="175"/>
+      <w:bookmarkEnd w:id="176"/>
     </w:p>
     <w:p>
       <w:pPr>
@@ -11219,7 +10925,7 @@
       <w:r>
         <w:instrText xml:space="preserve"> TC "</w:instrText>
       </w:r>
-      <w:bookmarkStart w:id="176" w:name="_Toc183094443"/>
+      <w:bookmarkStart w:id="177" w:name="_Toc183094443"/>
       <w:r>
         <w:instrText>3.1.1</w:instrText>
       </w:r>
@@ -11227,7 +10933,7 @@
         <w:tab/>
         <w:instrText>Analysis of primary outcomes</w:instrText>
       </w:r>
-      <w:bookmarkEnd w:id="176"/>
+      <w:bookmarkEnd w:id="177"/>
       <w:r>
         <w:instrText xml:space="preserve">" \f C \l "1" </w:instrText>
       </w:r>
@@ -11239,18 +10945,18 @@
       <w:pPr>
         <w:pStyle w:val="Heading2"/>
       </w:pPr>
-      <w:bookmarkStart w:id="177" w:name="_Toc185323561"/>
-      <w:bookmarkStart w:id="178" w:name="_Toc183099278"/>
-      <w:bookmarkStart w:id="179" w:name="_Toc185323562"/>
-      <w:bookmarkEnd w:id="177"/>
+      <w:bookmarkStart w:id="178" w:name="_Toc185323561"/>
+      <w:bookmarkStart w:id="179" w:name="_Toc183099278"/>
+      <w:bookmarkStart w:id="180" w:name="_Toc185323562"/>
+      <w:bookmarkEnd w:id="178"/>
       <w:r>
         <w:t>Analysis of</w:t>
       </w:r>
       <w:r>
         <w:t xml:space="preserve"> secondary outcomes</w:t>
       </w:r>
-      <w:bookmarkEnd w:id="178"/>
       <w:bookmarkEnd w:id="179"/>
+      <w:bookmarkEnd w:id="180"/>
       <w:r>
         <w:t xml:space="preserve"> </w:t>
       </w:r>
@@ -11260,7 +10966,7 @@
       <w:r>
         <w:instrText xml:space="preserve"> TC "</w:instrText>
       </w:r>
-      <w:bookmarkStart w:id="180" w:name="_Toc183094444"/>
+      <w:bookmarkStart w:id="181" w:name="_Toc183094444"/>
       <w:r>
         <w:instrText>3.1.2</w:instrText>
       </w:r>
@@ -11268,7 +10974,7 @@
         <w:tab/>
         <w:instrText>Analysis of secondary outcomes</w:instrText>
       </w:r>
-      <w:bookmarkEnd w:id="180"/>
+      <w:bookmarkEnd w:id="181"/>
       <w:r>
         <w:instrText xml:space="preserve">" \f C \l "1" </w:instrText>
       </w:r>
@@ -11319,27 +11025,27 @@
       <w:pPr>
         <w:pStyle w:val="Heading2"/>
       </w:pPr>
-      <w:bookmarkStart w:id="181" w:name="_Toc183099279"/>
-      <w:bookmarkStart w:id="182" w:name="_Toc183100570"/>
-      <w:bookmarkStart w:id="183" w:name="_Toc185323563"/>
-      <w:bookmarkStart w:id="184" w:name="_Toc183099280"/>
-      <w:bookmarkStart w:id="185" w:name="_Toc183100571"/>
-      <w:bookmarkStart w:id="186" w:name="_Toc185323564"/>
-      <w:bookmarkStart w:id="187" w:name="_Toc183099281"/>
-      <w:bookmarkStart w:id="188" w:name="_Toc185323565"/>
-      <w:bookmarkEnd w:id="181"/>
+      <w:bookmarkStart w:id="182" w:name="_Toc183099279"/>
+      <w:bookmarkStart w:id="183" w:name="_Toc183100570"/>
+      <w:bookmarkStart w:id="184" w:name="_Toc185323563"/>
+      <w:bookmarkStart w:id="185" w:name="_Toc183099280"/>
+      <w:bookmarkStart w:id="186" w:name="_Toc183100571"/>
+      <w:bookmarkStart w:id="187" w:name="_Toc185323564"/>
+      <w:bookmarkStart w:id="188" w:name="_Toc183099281"/>
+      <w:bookmarkStart w:id="189" w:name="_Toc185323565"/>
       <w:bookmarkEnd w:id="182"/>
       <w:bookmarkEnd w:id="183"/>
       <w:bookmarkEnd w:id="184"/>
       <w:bookmarkEnd w:id="185"/>
       <w:bookmarkEnd w:id="186"/>
-      <w:commentRangeStart w:id="189"/>
+      <w:bookmarkEnd w:id="187"/>
+      <w:commentRangeStart w:id="190"/>
       <w:r>
         <w:t>Time points</w:t>
       </w:r>
-      <w:bookmarkEnd w:id="187"/>
       <w:bookmarkEnd w:id="188"/>
-      <w:commentRangeEnd w:id="189"/>
+      <w:bookmarkEnd w:id="189"/>
+      <w:commentRangeEnd w:id="190"/>
       <w:r>
         <w:rPr>
           <w:rStyle w:val="CommentReference"/>
@@ -11348,7 +11054,7 @@
           <w:u w:val="none"/>
           <w:lang w:val="en-US"/>
         </w:rPr>
-        <w:commentReference w:id="189"/>
+        <w:commentReference w:id="190"/>
       </w:r>
       <w:r>
         <w:fldChar w:fldCharType="begin"/>
@@ -11356,11 +11062,11 @@
       <w:r>
         <w:instrText xml:space="preserve"> TC "</w:instrText>
       </w:r>
-      <w:bookmarkStart w:id="190" w:name="_Toc183094446"/>
+      <w:bookmarkStart w:id="191" w:name="_Toc183094446"/>
       <w:r>
         <w:instrText>Time points</w:instrText>
       </w:r>
-      <w:bookmarkEnd w:id="190"/>
+      <w:bookmarkEnd w:id="191"/>
       <w:r>
         <w:instrText xml:space="preserve">" \f C \l "1" </w:instrText>
       </w:r>
@@ -11449,16 +11155,16 @@
       <w:pPr>
         <w:pStyle w:val="Heading2"/>
       </w:pPr>
-      <w:bookmarkStart w:id="191" w:name="_Toc183099282"/>
-      <w:bookmarkStart w:id="192" w:name="_Toc185323566"/>
-      <w:commentRangeStart w:id="193"/>
+      <w:bookmarkStart w:id="192" w:name="_Toc183099282"/>
+      <w:bookmarkStart w:id="193" w:name="_Toc185323566"/>
       <w:commentRangeStart w:id="194"/>
+      <w:commentRangeStart w:id="195"/>
       <w:r>
         <w:t>Stratification and clustering</w:t>
       </w:r>
-      <w:bookmarkEnd w:id="191"/>
       <w:bookmarkEnd w:id="192"/>
-      <w:commentRangeEnd w:id="193"/>
+      <w:bookmarkEnd w:id="193"/>
+      <w:commentRangeEnd w:id="194"/>
       <w:r>
         <w:rPr>
           <w:rStyle w:val="CommentReference"/>
@@ -11467,9 +11173,9 @@
           <w:u w:val="none"/>
           <w:lang w:val="en-US"/>
         </w:rPr>
-        <w:commentReference w:id="193"/>
-      </w:r>
-      <w:commentRangeEnd w:id="194"/>
+        <w:commentReference w:id="194"/>
+      </w:r>
+      <w:commentRangeEnd w:id="195"/>
       <w:r>
         <w:rPr>
           <w:rStyle w:val="CommentReference"/>
@@ -11478,7 +11184,7 @@
           <w:u w:val="none"/>
           <w:lang w:val="en-US"/>
         </w:rPr>
-        <w:commentReference w:id="194"/>
+        <w:commentReference w:id="195"/>
       </w:r>
       <w:r>
         <w:fldChar w:fldCharType="begin"/>
@@ -11486,11 +11192,11 @@
       <w:r>
         <w:instrText xml:space="preserve"> TC "</w:instrText>
       </w:r>
-      <w:bookmarkStart w:id="195" w:name="_Toc183094447"/>
+      <w:bookmarkStart w:id="196" w:name="_Toc183094447"/>
       <w:r>
         <w:instrText>Stratification and clustering</w:instrText>
       </w:r>
-      <w:bookmarkEnd w:id="195"/>
+      <w:bookmarkEnd w:id="196"/>
       <w:r>
         <w:instrText xml:space="preserve">" \f C \l "1" </w:instrText>
       </w:r>
@@ -11547,24 +11253,24 @@
       <w:pPr>
         <w:pStyle w:val="Heading2"/>
       </w:pPr>
-      <w:bookmarkStart w:id="196" w:name="_Toc183099283"/>
-      <w:bookmarkStart w:id="197" w:name="_Toc185323567"/>
+      <w:bookmarkStart w:id="197" w:name="_Toc183099283"/>
+      <w:bookmarkStart w:id="198" w:name="_Toc185323567"/>
       <w:r>
         <w:t>Missing items in scales and subscales</w:t>
       </w:r>
-      <w:bookmarkEnd w:id="196"/>
       <w:bookmarkEnd w:id="197"/>
+      <w:bookmarkEnd w:id="198"/>
       <w:r>
         <w:fldChar w:fldCharType="begin"/>
       </w:r>
       <w:r>
         <w:instrText xml:space="preserve"> TC "</w:instrText>
       </w:r>
-      <w:bookmarkStart w:id="198" w:name="_Toc183094448"/>
+      <w:bookmarkStart w:id="199" w:name="_Toc183094448"/>
       <w:r>
         <w:instrText>Missing items in scales and subscales</w:instrText>
       </w:r>
-      <w:bookmarkEnd w:id="198"/>
+      <w:bookmarkEnd w:id="199"/>
       <w:r>
         <w:instrText xml:space="preserve">" \f C \l "1" </w:instrText>
       </w:r>
@@ -11629,24 +11335,24 @@
       <w:pPr>
         <w:pStyle w:val="Heading2"/>
       </w:pPr>
-      <w:bookmarkStart w:id="199" w:name="_Toc183099284"/>
-      <w:bookmarkStart w:id="200" w:name="_Toc185323568"/>
+      <w:bookmarkStart w:id="200" w:name="_Toc183099284"/>
+      <w:bookmarkStart w:id="201" w:name="_Toc185323568"/>
       <w:r>
         <w:t>Missing baseline data</w:t>
       </w:r>
-      <w:bookmarkEnd w:id="199"/>
       <w:bookmarkEnd w:id="200"/>
+      <w:bookmarkEnd w:id="201"/>
       <w:r>
         <w:fldChar w:fldCharType="begin"/>
       </w:r>
       <w:r>
         <w:instrText xml:space="preserve"> TC "</w:instrText>
       </w:r>
-      <w:bookmarkStart w:id="201" w:name="_Toc183094449"/>
+      <w:bookmarkStart w:id="202" w:name="_Toc183094449"/>
       <w:r>
         <w:instrText>Missing baseline data</w:instrText>
       </w:r>
-      <w:bookmarkEnd w:id="201"/>
+      <w:bookmarkEnd w:id="202"/>
       <w:r>
         <w:instrText xml:space="preserve">" \f C \l "1" </w:instrText>
       </w:r>
@@ -11756,24 +11462,24 @@
       <w:pPr>
         <w:pStyle w:val="Heading2"/>
       </w:pPr>
-      <w:bookmarkStart w:id="202" w:name="_Toc183099285"/>
-      <w:bookmarkStart w:id="203" w:name="_Toc185323569"/>
+      <w:bookmarkStart w:id="203" w:name="_Toc183099285"/>
+      <w:bookmarkStart w:id="204" w:name="_Toc185323569"/>
       <w:r>
         <w:t>Missing outcome data</w:t>
       </w:r>
-      <w:bookmarkEnd w:id="202"/>
       <w:bookmarkEnd w:id="203"/>
+      <w:bookmarkEnd w:id="204"/>
       <w:r>
         <w:fldChar w:fldCharType="begin"/>
       </w:r>
       <w:r>
         <w:instrText xml:space="preserve"> TC "</w:instrText>
       </w:r>
-      <w:bookmarkStart w:id="204" w:name="_Toc183094450"/>
+      <w:bookmarkStart w:id="205" w:name="_Toc183094450"/>
       <w:r>
         <w:instrText>Missing outcome data</w:instrText>
       </w:r>
-      <w:bookmarkEnd w:id="204"/>
+      <w:bookmarkEnd w:id="205"/>
       <w:r>
         <w:instrText xml:space="preserve">" \f C \l "1" </w:instrText>
       </w:r>
@@ -11872,16 +11578,16 @@
       <w:pPr>
         <w:pStyle w:val="Heading2"/>
       </w:pPr>
-      <w:bookmarkStart w:id="205" w:name="_Toc183099286"/>
-      <w:bookmarkStart w:id="206" w:name="_Toc185323570"/>
+      <w:bookmarkStart w:id="206" w:name="_Toc183099286"/>
+      <w:bookmarkStart w:id="207" w:name="_Toc185323570"/>
       <w:r>
         <w:t>Method for handling multiple comparisons</w:t>
       </w:r>
       <w:r>
         <w:t>/multiplicity</w:t>
       </w:r>
-      <w:bookmarkEnd w:id="205"/>
       <w:bookmarkEnd w:id="206"/>
+      <w:bookmarkEnd w:id="207"/>
     </w:p>
     <w:p>
       <w:pPr>
@@ -12095,32 +11801,32 @@
       <w:pPr>
         <w:pStyle w:val="Heading2"/>
       </w:pPr>
-      <w:bookmarkStart w:id="207" w:name="_Toc183099287"/>
-      <w:bookmarkStart w:id="208" w:name="_Toc185323571"/>
-      <w:commentRangeStart w:id="209"/>
+      <w:bookmarkStart w:id="208" w:name="_Toc183099287"/>
+      <w:bookmarkStart w:id="209" w:name="_Toc185323571"/>
+      <w:commentRangeStart w:id="210"/>
       <w:r>
         <w:t>Method for handling non-compliance (per protocol/CACE analyses)</w:t>
       </w:r>
-      <w:bookmarkEnd w:id="207"/>
       <w:bookmarkEnd w:id="208"/>
+      <w:bookmarkEnd w:id="209"/>
       <w:r>
         <w:fldChar w:fldCharType="begin"/>
       </w:r>
       <w:r>
         <w:instrText xml:space="preserve"> TC "</w:instrText>
       </w:r>
-      <w:bookmarkStart w:id="210" w:name="_Toc183094452"/>
+      <w:bookmarkStart w:id="211" w:name="_Toc183094452"/>
       <w:r>
         <w:instrText>Method for handling non-compliance (per protocol/CACE analyses)</w:instrText>
       </w:r>
-      <w:bookmarkEnd w:id="210"/>
+      <w:bookmarkEnd w:id="211"/>
       <w:r>
         <w:instrText xml:space="preserve">" \f C \l "1" </w:instrText>
       </w:r>
       <w:r>
         <w:fldChar w:fldCharType="end"/>
       </w:r>
-      <w:commentRangeEnd w:id="209"/>
+      <w:commentRangeEnd w:id="210"/>
       <w:r>
         <w:rPr>
           <w:rStyle w:val="CommentReference"/>
@@ -12129,7 +11835,7 @@
           <w:u w:val="none"/>
           <w:lang w:val="en-US"/>
         </w:rPr>
-        <w:commentReference w:id="209"/>
+        <w:commentReference w:id="210"/>
       </w:r>
     </w:p>
     <w:p>
@@ -12205,17 +11911,17 @@
       <w:pPr>
         <w:pStyle w:val="Heading2"/>
       </w:pPr>
-      <w:bookmarkStart w:id="211" w:name="_Toc185323572"/>
-      <w:bookmarkStart w:id="212" w:name="_Toc183099288"/>
-      <w:bookmarkStart w:id="213" w:name="_Toc185323573"/>
-      <w:bookmarkEnd w:id="211"/>
-      <w:commentRangeStart w:id="214"/>
+      <w:bookmarkStart w:id="212" w:name="_Toc185323572"/>
+      <w:bookmarkStart w:id="213" w:name="_Toc183099288"/>
+      <w:bookmarkStart w:id="214" w:name="_Toc185323573"/>
+      <w:bookmarkEnd w:id="212"/>
+      <w:commentRangeStart w:id="215"/>
       <w:r>
         <w:t>Model assumption checks</w:t>
       </w:r>
-      <w:bookmarkEnd w:id="212"/>
       <w:bookmarkEnd w:id="213"/>
-      <w:commentRangeEnd w:id="214"/>
+      <w:bookmarkEnd w:id="214"/>
+      <w:commentRangeEnd w:id="215"/>
       <w:r>
         <w:rPr>
           <w:rStyle w:val="CommentReference"/>
@@ -12224,7 +11930,7 @@
           <w:u w:val="none"/>
           <w:lang w:val="en-US"/>
         </w:rPr>
-        <w:commentReference w:id="214"/>
+        <w:commentReference w:id="215"/>
       </w:r>
     </w:p>
     <w:p>
@@ -12287,7 +11993,7 @@
         </w:rPr>
         <w:instrText xml:space="preserve"> TC "</w:instrText>
       </w:r>
-      <w:bookmarkStart w:id="215" w:name="_Toc183094453"/>
+      <w:bookmarkStart w:id="216" w:name="_Toc183094453"/>
       <w:r>
         <w:rPr>
           <w:i/>
@@ -12298,7 +12004,7 @@
         </w:rPr>
         <w:instrText>Model assumption checks</w:instrText>
       </w:r>
-      <w:bookmarkEnd w:id="215"/>
+      <w:bookmarkEnd w:id="216"/>
       <w:r>
         <w:rPr>
           <w:i/>
@@ -12378,15 +12084,15 @@
       <w:pPr>
         <w:pStyle w:val="Heading2"/>
       </w:pPr>
-      <w:bookmarkStart w:id="216" w:name="_Toc183099289"/>
-      <w:bookmarkStart w:id="217" w:name="_Toc185323574"/>
-      <w:commentRangeStart w:id="218"/>
+      <w:bookmarkStart w:id="217" w:name="_Toc183099289"/>
+      <w:bookmarkStart w:id="218" w:name="_Toc185323574"/>
+      <w:commentRangeStart w:id="219"/>
       <w:r>
         <w:t>Sensitivity analyses</w:t>
       </w:r>
-      <w:bookmarkEnd w:id="216"/>
       <w:bookmarkEnd w:id="217"/>
-      <w:commentRangeEnd w:id="218"/>
+      <w:bookmarkEnd w:id="218"/>
+      <w:commentRangeEnd w:id="219"/>
       <w:r>
         <w:rPr>
           <w:rStyle w:val="CommentReference"/>
@@ -12395,7 +12101,7 @@
           <w:u w:val="none"/>
           <w:lang w:val="en-US"/>
         </w:rPr>
-        <w:commentReference w:id="218"/>
+        <w:commentReference w:id="219"/>
       </w:r>
       <w:r>
         <w:fldChar w:fldCharType="begin"/>
@@ -12403,7 +12109,7 @@
       <w:r>
         <w:instrText xml:space="preserve"> TC "</w:instrText>
       </w:r>
-      <w:bookmarkStart w:id="219" w:name="_Toc183094454"/>
+      <w:bookmarkStart w:id="220" w:name="_Toc183094454"/>
       <w:r>
         <w:instrText>3.1.4</w:instrText>
       </w:r>
@@ -12411,7 +12117,7 @@
         <w:tab/>
         <w:instrText>Sensitivity analyses</w:instrText>
       </w:r>
-      <w:bookmarkEnd w:id="219"/>
+      <w:bookmarkEnd w:id="220"/>
       <w:r>
         <w:instrText xml:space="preserve">" \f C \l "1" </w:instrText>
       </w:r>
@@ -12452,20 +12158,20 @@
       <w:pPr>
         <w:pStyle w:val="Heading2"/>
       </w:pPr>
-      <w:bookmarkStart w:id="220" w:name="_Toc183099290"/>
-      <w:bookmarkStart w:id="221" w:name="_Toc185323575"/>
+      <w:bookmarkStart w:id="221" w:name="_Toc183099290"/>
+      <w:bookmarkStart w:id="222" w:name="_Toc185323575"/>
       <w:r>
         <w:t>Planned subgroup analyses</w:t>
       </w:r>
-      <w:bookmarkEnd w:id="220"/>
       <w:bookmarkEnd w:id="221"/>
+      <w:bookmarkEnd w:id="222"/>
       <w:r>
         <w:fldChar w:fldCharType="begin"/>
       </w:r>
       <w:r>
         <w:instrText xml:space="preserve"> TC "</w:instrText>
       </w:r>
-      <w:bookmarkStart w:id="222" w:name="_Toc183094455"/>
+      <w:bookmarkStart w:id="223" w:name="_Toc183094455"/>
       <w:r>
         <w:instrText>3.1.5</w:instrText>
       </w:r>
@@ -12473,7 +12179,7 @@
         <w:tab/>
         <w:instrText>Planned subgroup analyses</w:instrText>
       </w:r>
-      <w:bookmarkEnd w:id="222"/>
+      <w:bookmarkEnd w:id="223"/>
       <w:r>
         <w:instrText xml:space="preserve">" \f C \l "1" </w:instrText>
       </w:r>
@@ -12530,20 +12236,20 @@
       <w:pPr>
         <w:pStyle w:val="Heading2"/>
       </w:pPr>
-      <w:bookmarkStart w:id="223" w:name="_Toc183099291"/>
-      <w:bookmarkStart w:id="224" w:name="_Toc185323576"/>
+      <w:bookmarkStart w:id="224" w:name="_Toc183099291"/>
+      <w:bookmarkStart w:id="225" w:name="_Toc185323576"/>
       <w:r>
         <w:t>Exploratory analyses</w:t>
       </w:r>
-      <w:bookmarkEnd w:id="223"/>
       <w:bookmarkEnd w:id="224"/>
+      <w:bookmarkEnd w:id="225"/>
       <w:r>
         <w:fldChar w:fldCharType="begin"/>
       </w:r>
       <w:r>
         <w:instrText xml:space="preserve"> TC "</w:instrText>
       </w:r>
-      <w:bookmarkStart w:id="225" w:name="_Toc183094456"/>
+      <w:bookmarkStart w:id="226" w:name="_Toc183094456"/>
       <w:r>
         <w:instrText>3.2</w:instrText>
       </w:r>
@@ -12551,7 +12257,7 @@
         <w:tab/>
         <w:instrText>Exploratory analyses</w:instrText>
       </w:r>
-      <w:bookmarkEnd w:id="225"/>
+      <w:bookmarkEnd w:id="226"/>
       <w:r>
         <w:instrText xml:space="preserve">" \f C \l "1" </w:instrText>
       </w:r>
@@ -12594,21 +12300,21 @@
       <w:pPr>
         <w:pStyle w:val="Heading2"/>
       </w:pPr>
-      <w:bookmarkStart w:id="226" w:name="_Toc183099292"/>
-      <w:bookmarkStart w:id="227" w:name="_Toc185323577"/>
+      <w:bookmarkStart w:id="227" w:name="_Toc183099292"/>
+      <w:bookmarkStart w:id="228" w:name="_Toc185323577"/>
       <w:r>
         <w:lastRenderedPageBreak/>
         <w:t>Exploratory mediator and moderator analysis</w:t>
       </w:r>
-      <w:bookmarkEnd w:id="226"/>
       <w:bookmarkEnd w:id="227"/>
+      <w:bookmarkEnd w:id="228"/>
       <w:r>
         <w:fldChar w:fldCharType="begin"/>
       </w:r>
       <w:r>
         <w:instrText xml:space="preserve"> TC "</w:instrText>
       </w:r>
-      <w:bookmarkStart w:id="228" w:name="_Toc183094457"/>
+      <w:bookmarkStart w:id="229" w:name="_Toc183094457"/>
       <w:r>
         <w:instrText>3.3</w:instrText>
       </w:r>
@@ -12616,7 +12322,7 @@
         <w:tab/>
         <w:instrText>Exploratory mediator and moderator analysis</w:instrText>
       </w:r>
-      <w:bookmarkEnd w:id="228"/>
+      <w:bookmarkEnd w:id="229"/>
       <w:r>
         <w:instrText xml:space="preserve">" \f C \l "1" </w:instrText>
       </w:r>
@@ -12723,20 +12429,20 @@
       <w:pPr>
         <w:pStyle w:val="Heading2"/>
       </w:pPr>
-      <w:bookmarkStart w:id="229" w:name="_Toc183099293"/>
-      <w:bookmarkStart w:id="230" w:name="_Toc185323578"/>
+      <w:bookmarkStart w:id="230" w:name="_Toc183099293"/>
+      <w:bookmarkStart w:id="231" w:name="_Toc185323578"/>
       <w:r>
         <w:t>Interim analysis</w:t>
       </w:r>
-      <w:bookmarkEnd w:id="229"/>
       <w:bookmarkEnd w:id="230"/>
+      <w:bookmarkEnd w:id="231"/>
       <w:r>
         <w:fldChar w:fldCharType="begin"/>
       </w:r>
       <w:r>
         <w:instrText xml:space="preserve"> TC "</w:instrText>
       </w:r>
-      <w:bookmarkStart w:id="231" w:name="_Toc183094458"/>
+      <w:bookmarkStart w:id="232" w:name="_Toc183094458"/>
       <w:r>
         <w:instrText>3.4</w:instrText>
       </w:r>
@@ -12744,7 +12450,7 @@
         <w:tab/>
         <w:instrText>Interim analysis</w:instrText>
       </w:r>
-      <w:bookmarkEnd w:id="231"/>
+      <w:bookmarkEnd w:id="232"/>
       <w:r>
         <w:instrText xml:space="preserve">" \f C \l "1" </w:instrText>
       </w:r>
@@ -12803,26 +12509,26 @@
       <w:pPr>
         <w:pStyle w:val="Heading1"/>
       </w:pPr>
-      <w:bookmarkStart w:id="232" w:name="_Toc183099294"/>
-      <w:bookmarkStart w:id="233" w:name="_Toc185323579"/>
+      <w:bookmarkStart w:id="233" w:name="_Toc183099294"/>
+      <w:bookmarkStart w:id="234" w:name="_Toc185323579"/>
       <w:r>
         <w:lastRenderedPageBreak/>
         <w:t>Quality Control and Quality Assurance</w:t>
       </w:r>
-      <w:bookmarkEnd w:id="232"/>
       <w:bookmarkEnd w:id="233"/>
+      <w:bookmarkEnd w:id="234"/>
     </w:p>
     <w:p>
       <w:pPr>
         <w:pStyle w:val="Heading2"/>
       </w:pPr>
-      <w:bookmarkStart w:id="234" w:name="_Toc183099295"/>
-      <w:bookmarkStart w:id="235" w:name="_Toc185323580"/>
+      <w:bookmarkStart w:id="235" w:name="_Toc183099295"/>
+      <w:bookmarkStart w:id="236" w:name="_Toc185323580"/>
       <w:r>
         <w:t>Quality control</w:t>
       </w:r>
-      <w:bookmarkEnd w:id="234"/>
       <w:bookmarkEnd w:id="235"/>
+      <w:bookmarkEnd w:id="236"/>
     </w:p>
     <w:p>
       <w:pPr>
@@ -12975,13 +12681,13 @@
       <w:pPr>
         <w:pStyle w:val="Heading2"/>
       </w:pPr>
-      <w:bookmarkStart w:id="236" w:name="_Toc183099296"/>
-      <w:bookmarkStart w:id="237" w:name="_Toc185323581"/>
+      <w:bookmarkStart w:id="237" w:name="_Toc183099296"/>
+      <w:bookmarkStart w:id="238" w:name="_Toc185323581"/>
       <w:r>
         <w:t>Carrying out the final analysis</w:t>
       </w:r>
-      <w:bookmarkEnd w:id="236"/>
       <w:bookmarkEnd w:id="237"/>
+      <w:bookmarkEnd w:id="238"/>
     </w:p>
     <w:p>
       <w:pPr>
@@ -13070,13 +12776,13 @@
       <w:pPr>
         <w:pStyle w:val="Heading2"/>
       </w:pPr>
-      <w:bookmarkStart w:id="238" w:name="_Toc183099297"/>
-      <w:bookmarkStart w:id="239" w:name="_Toc185323582"/>
+      <w:bookmarkStart w:id="239" w:name="_Toc183099297"/>
+      <w:bookmarkStart w:id="240" w:name="_Toc185323582"/>
       <w:r>
         <w:t>Approval and version control of the SAP</w:t>
       </w:r>
-      <w:bookmarkEnd w:id="238"/>
       <w:bookmarkEnd w:id="239"/>
+      <w:bookmarkEnd w:id="240"/>
     </w:p>
     <w:p>
       <w:pPr>
@@ -13261,13 +12967,13 @@
       <w:pPr>
         <w:pStyle w:val="Heading2"/>
       </w:pPr>
-      <w:bookmarkStart w:id="240" w:name="_Toc183099298"/>
-      <w:bookmarkStart w:id="241" w:name="_Toc185323583"/>
+      <w:bookmarkStart w:id="241" w:name="_Toc183099298"/>
+      <w:bookmarkStart w:id="242" w:name="_Toc185323583"/>
       <w:r>
         <w:t>Quality Assurance</w:t>
       </w:r>
-      <w:bookmarkEnd w:id="240"/>
       <w:bookmarkEnd w:id="241"/>
+      <w:bookmarkEnd w:id="242"/>
     </w:p>
     <w:p>
       <w:pPr>
@@ -13302,21 +13008,21 @@
       <w:pPr>
         <w:pStyle w:val="Heading1"/>
       </w:pPr>
-      <w:bookmarkStart w:id="242" w:name="_Toc183099299"/>
-      <w:bookmarkStart w:id="243" w:name="_Toc185323584"/>
+      <w:bookmarkStart w:id="243" w:name="_Toc183099299"/>
+      <w:bookmarkStart w:id="244" w:name="_Toc185323584"/>
       <w:r>
         <w:lastRenderedPageBreak/>
         <w:t>Software</w:t>
       </w:r>
-      <w:bookmarkEnd w:id="242"/>
       <w:bookmarkEnd w:id="243"/>
+      <w:bookmarkEnd w:id="244"/>
       <w:r>
         <w:fldChar w:fldCharType="begin"/>
       </w:r>
       <w:r>
         <w:instrText xml:space="preserve"> TC "</w:instrText>
       </w:r>
-      <w:bookmarkStart w:id="244" w:name="_Toc183094459"/>
+      <w:bookmarkStart w:id="245" w:name="_Toc183094459"/>
       <w:r>
         <w:instrText>4.</w:instrText>
       </w:r>
@@ -13324,7 +13030,7 @@
         <w:tab/>
         <w:instrText>Software</w:instrText>
       </w:r>
-      <w:bookmarkEnd w:id="244"/>
+      <w:bookmarkEnd w:id="245"/>
       <w:r>
         <w:instrText xml:space="preserve">" \f C \l "1" </w:instrText>
       </w:r>
@@ -13336,13 +13042,13 @@
       <w:pPr>
         <w:pStyle w:val="Heading2"/>
       </w:pPr>
-      <w:bookmarkStart w:id="245" w:name="_Toc185323585"/>
-      <w:bookmarkStart w:id="246" w:name="_Toc185323586"/>
-      <w:bookmarkEnd w:id="245"/>
+      <w:bookmarkStart w:id="246" w:name="_Toc185323585"/>
+      <w:bookmarkStart w:id="247" w:name="_Toc185323586"/>
+      <w:bookmarkEnd w:id="246"/>
       <w:r>
         <w:t>Data management</w:t>
       </w:r>
-      <w:bookmarkEnd w:id="246"/>
+      <w:bookmarkEnd w:id="247"/>
       <w:r>
         <w:t xml:space="preserve"> </w:t>
       </w:r>
@@ -13421,7 +13127,7 @@
           <w:szCs w:val="22"/>
         </w:rPr>
       </w:pPr>
-      <w:bookmarkStart w:id="247" w:name="_Toc185323587"/>
+      <w:bookmarkStart w:id="248" w:name="_Toc185323587"/>
       <w:r>
         <w:t>A</w:t>
       </w:r>
@@ -13431,7 +13137,7 @@
       <w:r>
         <w:t>software</w:t>
       </w:r>
-      <w:bookmarkEnd w:id="247"/>
+      <w:bookmarkEnd w:id="248"/>
       <w:r>
         <w:rPr>
           <w:sz w:val="22"/>
@@ -13536,15 +13242,15 @@
       <w:pPr>
         <w:pStyle w:val="Heading1"/>
       </w:pPr>
-      <w:bookmarkStart w:id="250" w:name="_Toc183099300"/>
-      <w:bookmarkStart w:id="251" w:name="_Toc185323588"/>
-      <w:commentRangeStart w:id="252"/>
+      <w:bookmarkStart w:id="251" w:name="_Toc183099300"/>
+      <w:bookmarkStart w:id="252" w:name="_Toc185323588"/>
+      <w:commentRangeStart w:id="253"/>
       <w:r>
         <w:t>Scoring of outcome measures</w:t>
       </w:r>
-      <w:bookmarkEnd w:id="250"/>
       <w:bookmarkEnd w:id="251"/>
-      <w:commentRangeEnd w:id="252"/>
+      <w:bookmarkEnd w:id="252"/>
+      <w:commentRangeEnd w:id="253"/>
       <w:r>
         <w:rPr>
           <w:rStyle w:val="CommentReference"/>
@@ -13553,7 +13259,7 @@
           <w:kern w:val="0"/>
           <w:lang w:val="en-US"/>
         </w:rPr>
-        <w:commentReference w:id="252"/>
+        <w:commentReference w:id="253"/>
       </w:r>
     </w:p>
     <w:p>
@@ -14114,8 +13820,8 @@
       <w:pPr>
         <w:pStyle w:val="Heading1"/>
       </w:pPr>
-      <w:bookmarkStart w:id="253" w:name="_Toc183099301"/>
-      <w:bookmarkStart w:id="254" w:name="_Toc185323589"/>
+      <w:bookmarkStart w:id="254" w:name="_Toc183099301"/>
+      <w:bookmarkStart w:id="255" w:name="_Toc185323589"/>
       <w:r>
         <w:t>Health Economic Analysis Plan</w:t>
       </w:r>
@@ -14128,19 +13834,19 @@
       <w:r>
         <w:t>)</w:t>
       </w:r>
-      <w:bookmarkEnd w:id="253"/>
       <w:bookmarkEnd w:id="254"/>
+      <w:bookmarkEnd w:id="255"/>
       <w:r>
         <w:fldChar w:fldCharType="begin"/>
       </w:r>
       <w:r>
         <w:instrText xml:space="preserve"> TC "</w:instrText>
       </w:r>
-      <w:bookmarkStart w:id="255" w:name="_Toc183094460"/>
+      <w:bookmarkStart w:id="256" w:name="_Toc183094460"/>
       <w:r>
         <w:instrText>B)  ECONOMIC ANALYSIS PLAN</w:instrText>
       </w:r>
-      <w:bookmarkEnd w:id="255"/>
+      <w:bookmarkEnd w:id="256"/>
       <w:r>
         <w:instrText xml:space="preserve">" \f C \l "1" </w:instrText>
       </w:r>
@@ -14215,18 +13921,18 @@
         <w:lastRenderedPageBreak/>
         <w:t xml:space="preserve"> </w:t>
       </w:r>
-      <w:bookmarkStart w:id="256" w:name="_Toc183099302"/>
-      <w:bookmarkStart w:id="257" w:name="_Toc185323590"/>
+      <w:bookmarkStart w:id="257" w:name="_Toc183099302"/>
+      <w:bookmarkStart w:id="258" w:name="_Toc185323590"/>
       <w:r>
         <w:t xml:space="preserve">Schedule Of Assessments And </w:t>
       </w:r>
-      <w:commentRangeStart w:id="258"/>
+      <w:commentRangeStart w:id="259"/>
       <w:r>
         <w:t>Measures</w:t>
       </w:r>
-      <w:bookmarkEnd w:id="256"/>
       <w:bookmarkEnd w:id="257"/>
-      <w:commentRangeEnd w:id="258"/>
+      <w:bookmarkEnd w:id="258"/>
+      <w:commentRangeEnd w:id="259"/>
       <w:r>
         <w:rPr>
           <w:rStyle w:val="CommentReference"/>
@@ -14235,7 +13941,7 @@
           <w:kern w:val="0"/>
           <w:lang w:val="en-US"/>
         </w:rPr>
-        <w:commentReference w:id="258"/>
+        <w:commentReference w:id="259"/>
       </w:r>
       <w:r>
         <w:fldChar w:fldCharType="begin"/>
@@ -14243,11 +13949,11 @@
       <w:r>
         <w:instrText xml:space="preserve"> TC "</w:instrText>
       </w:r>
-      <w:bookmarkStart w:id="259" w:name="_Toc183094461"/>
+      <w:bookmarkStart w:id="260" w:name="_Toc183094461"/>
       <w:r>
         <w:instrText>C)  SCHEDULE OF ASSESSMENTS AND MEASURES</w:instrText>
       </w:r>
-      <w:bookmarkEnd w:id="259"/>
+      <w:bookmarkEnd w:id="260"/>
       <w:r>
         <w:instrText xml:space="preserve">" \f C \l "1" </w:instrText>
       </w:r>
@@ -14284,37 +13990,36 @@
       <w:pPr>
         <w:pStyle w:val="Heading1"/>
       </w:pPr>
-      <w:bookmarkStart w:id="260" w:name="_Toc183095060"/>
-      <w:bookmarkStart w:id="261" w:name="_Toc183095166"/>
-      <w:bookmarkStart w:id="262" w:name="_Toc183095512"/>
-      <w:bookmarkStart w:id="263" w:name="_Toc183099303"/>
-      <w:bookmarkStart w:id="264" w:name="_Toc183100594"/>
-      <w:bookmarkStart w:id="265" w:name="_Toc185323591"/>
-      <w:bookmarkStart w:id="266" w:name="_Toc183095061"/>
-      <w:bookmarkStart w:id="267" w:name="_Toc183095167"/>
-      <w:bookmarkStart w:id="268" w:name="_Toc183095513"/>
-      <w:bookmarkStart w:id="269" w:name="_Toc183099304"/>
-      <w:bookmarkStart w:id="270" w:name="_Toc183100595"/>
-      <w:bookmarkStart w:id="271" w:name="_Toc185323592"/>
-      <w:bookmarkStart w:id="272" w:name="_Toc183095062"/>
-      <w:bookmarkStart w:id="273" w:name="_Toc183095168"/>
-      <w:bookmarkStart w:id="274" w:name="_Toc183095514"/>
-      <w:bookmarkStart w:id="275" w:name="_Toc183099305"/>
-      <w:bookmarkStart w:id="276" w:name="_Toc183100596"/>
-      <w:bookmarkStart w:id="277" w:name="_Toc185323593"/>
-      <w:bookmarkStart w:id="278" w:name="_Toc183095063"/>
-      <w:bookmarkStart w:id="279" w:name="_Toc183095169"/>
-      <w:bookmarkStart w:id="280" w:name="_Toc183095515"/>
-      <w:bookmarkStart w:id="281" w:name="_Toc183099306"/>
-      <w:bookmarkStart w:id="282" w:name="_Toc183100597"/>
-      <w:bookmarkStart w:id="283" w:name="_Toc185323594"/>
-      <w:bookmarkStart w:id="284" w:name="_Toc183095064"/>
-      <w:bookmarkStart w:id="285" w:name="_Toc183095170"/>
-      <w:bookmarkStart w:id="286" w:name="_Toc183095516"/>
-      <w:bookmarkStart w:id="287" w:name="_Toc183099307"/>
-      <w:bookmarkStart w:id="288" w:name="_Toc183100598"/>
-      <w:bookmarkStart w:id="289" w:name="_Toc185323595"/>
-      <w:bookmarkEnd w:id="260"/>
+      <w:bookmarkStart w:id="261" w:name="_Toc183095060"/>
+      <w:bookmarkStart w:id="262" w:name="_Toc183095166"/>
+      <w:bookmarkStart w:id="263" w:name="_Toc183095512"/>
+      <w:bookmarkStart w:id="264" w:name="_Toc183099303"/>
+      <w:bookmarkStart w:id="265" w:name="_Toc183100594"/>
+      <w:bookmarkStart w:id="266" w:name="_Toc185323591"/>
+      <w:bookmarkStart w:id="267" w:name="_Toc183095061"/>
+      <w:bookmarkStart w:id="268" w:name="_Toc183095167"/>
+      <w:bookmarkStart w:id="269" w:name="_Toc183095513"/>
+      <w:bookmarkStart w:id="270" w:name="_Toc183099304"/>
+      <w:bookmarkStart w:id="271" w:name="_Toc183100595"/>
+      <w:bookmarkStart w:id="272" w:name="_Toc185323592"/>
+      <w:bookmarkStart w:id="273" w:name="_Toc183095062"/>
+      <w:bookmarkStart w:id="274" w:name="_Toc183095168"/>
+      <w:bookmarkStart w:id="275" w:name="_Toc183095514"/>
+      <w:bookmarkStart w:id="276" w:name="_Toc183099305"/>
+      <w:bookmarkStart w:id="277" w:name="_Toc183100596"/>
+      <w:bookmarkStart w:id="278" w:name="_Toc185323593"/>
+      <w:bookmarkStart w:id="279" w:name="_Toc183095063"/>
+      <w:bookmarkStart w:id="280" w:name="_Toc183095169"/>
+      <w:bookmarkStart w:id="281" w:name="_Toc183095515"/>
+      <w:bookmarkStart w:id="282" w:name="_Toc183099306"/>
+      <w:bookmarkStart w:id="283" w:name="_Toc183100597"/>
+      <w:bookmarkStart w:id="284" w:name="_Toc185323594"/>
+      <w:bookmarkStart w:id="285" w:name="_Toc183095064"/>
+      <w:bookmarkStart w:id="286" w:name="_Toc183095170"/>
+      <w:bookmarkStart w:id="287" w:name="_Toc183095516"/>
+      <w:bookmarkStart w:id="288" w:name="_Toc183099307"/>
+      <w:bookmarkStart w:id="289" w:name="_Toc183100598"/>
+      <w:bookmarkStart w:id="290" w:name="_Toc185323595"/>
       <w:bookmarkEnd w:id="261"/>
       <w:bookmarkEnd w:id="262"/>
       <w:bookmarkEnd w:id="263"/>
@@ -14344,28 +14049,29 @@
       <w:bookmarkEnd w:id="287"/>
       <w:bookmarkEnd w:id="288"/>
       <w:bookmarkEnd w:id="289"/>
+      <w:bookmarkEnd w:id="290"/>
       <w:r>
         <w:br w:type="page"/>
       </w:r>
-      <w:bookmarkStart w:id="290" w:name="_Toc183099308"/>
-      <w:bookmarkStart w:id="291" w:name="_Toc185323596"/>
+      <w:bookmarkStart w:id="291" w:name="_Toc183099308"/>
+      <w:bookmarkStart w:id="292" w:name="_Toc185323596"/>
       <w:r>
         <w:lastRenderedPageBreak/>
         <w:t>Reference list</w:t>
       </w:r>
-      <w:bookmarkEnd w:id="290"/>
       <w:bookmarkEnd w:id="291"/>
+      <w:bookmarkEnd w:id="292"/>
       <w:r>
         <w:fldChar w:fldCharType="begin"/>
       </w:r>
       <w:r>
         <w:instrText xml:space="preserve"> TC "</w:instrText>
       </w:r>
-      <w:bookmarkStart w:id="292" w:name="_Toc183094462"/>
+      <w:bookmarkStart w:id="293" w:name="_Toc183094462"/>
       <w:r>
         <w:instrText>Reference list</w:instrText>
       </w:r>
-      <w:bookmarkEnd w:id="292"/>
+      <w:bookmarkEnd w:id="293"/>
       <w:r>
         <w:instrText xml:space="preserve">" \f C \l "1" </w:instrText>
       </w:r>
@@ -14683,7 +14389,74 @@
       </w:r>
     </w:p>
   </w:comment>
-  <w:comment w:id="105" w:author="Hassan Jafari" w:date="2025-11-16T17:44:00Z" w:initials="HJ">
+  <w:comment w:id="39" w:author="Gordon Forbes" w:date="2025-11-25T12:01:00Z" w:initials="GF">
+    <w:p>
+      <w:r>
+        <w:rPr>
+          <w:rStyle w:val="CommentReference"/>
+        </w:rPr>
+        <w:annotationRef/>
+      </w:r>
+      <w:r>
+        <w:rPr>
+          <w:sz w:val="20"/>
+          <w:szCs w:val="20"/>
+        </w:rPr>
+        <w:t>I have removed baseline. We can decide weather to reinstate it</w:t>
+      </w:r>
+    </w:p>
+  </w:comment>
+  <w:comment w:id="52" w:author="Gordon Forbes" w:date="2025-11-25T12:03:00Z" w:initials="GF">
+    <w:p>
+      <w:r>
+        <w:rPr>
+          <w:rStyle w:val="CommentReference"/>
+        </w:rPr>
+        <w:annotationRef/>
+      </w:r>
+      <w:r>
+        <w:rPr>
+          <w:sz w:val="20"/>
+          <w:szCs w:val="20"/>
+        </w:rPr>
+        <w:t>Template desciption:</w:t>
+      </w:r>
+    </w:p>
+    <w:p/>
+    <w:p>
+      <w:r>
+        <w:rPr>
+          <w:i/>
+          <w:iCs/>
+          <w:sz w:val="20"/>
+          <w:szCs w:val="20"/>
+          <w:highlight w:val="yellow"/>
+        </w:rPr>
+        <w:t>Full details of the sample size calculation or reference to sample size calculation in the protocol or other document should be included here.</w:t>
+      </w:r>
+      <w:r>
+        <w:rPr>
+          <w:i/>
+          <w:iCs/>
+          <w:sz w:val="20"/>
+          <w:szCs w:val="20"/>
+        </w:rPr>
+        <w:t xml:space="preserve"> </w:t>
+      </w:r>
+      <w:r>
+        <w:rPr>
+          <w:i/>
+          <w:iCs/>
+          <w:sz w:val="20"/>
+          <w:szCs w:val="20"/>
+          <w:highlight w:val="yellow"/>
+        </w:rPr>
+        <w:t>Consider including the code used for the sample size calculation as an appendix to this document if sample size calculation was complex.</w:t>
+      </w:r>
+    </w:p>
+    <w:p/>
+  </w:comment>
+  <w:comment w:id="106" w:author="Hassan Jafari" w:date="2025-11-16T17:44:00Z" w:initials="HJ">
     <w:p>
       <w:pPr>
         <w:pStyle w:val="CommentText"/>
@@ -14703,7 +14476,7 @@
       </w:r>
     </w:p>
   </w:comment>
-  <w:comment w:id="109" w:author="Hassan Jafari" w:date="2025-11-16T17:56:00Z" w:initials="HJ">
+  <w:comment w:id="110" w:author="Hassan Jafari" w:date="2025-11-16T17:56:00Z" w:initials="HJ">
     <w:p>
       <w:pPr>
         <w:pStyle w:val="CommentText"/>
@@ -14719,7 +14492,7 @@
       </w:r>
     </w:p>
   </w:comment>
-  <w:comment w:id="112" w:author="Hassan Jafari" w:date="2025-11-16T18:07:00Z" w:initials="HJ">
+  <w:comment w:id="113" w:author="Hassan Jafari" w:date="2025-11-16T18:07:00Z" w:initials="HJ">
     <w:p>
       <w:pPr>
         <w:pStyle w:val="CommentText"/>
@@ -14755,7 +14528,7 @@
       </w:r>
     </w:p>
   </w:comment>
-  <w:comment w:id="118" w:author="Hassan Jafari" w:date="2025-11-16T17:56:00Z" w:initials="HJ">
+  <w:comment w:id="119" w:author="Hassan Jafari" w:date="2025-11-16T17:56:00Z" w:initials="HJ">
     <w:p>
       <w:pPr>
         <w:pStyle w:val="CommentText"/>
@@ -14771,7 +14544,7 @@
       </w:r>
     </w:p>
   </w:comment>
-  <w:comment w:id="189" w:author="Hassan Jafari" w:date="2025-10-22T14:16:00Z" w:initials="HJ">
+  <w:comment w:id="190" w:author="Hassan Jafari" w:date="2025-10-22T14:16:00Z" w:initials="HJ">
     <w:p>
       <w:pPr>
         <w:pStyle w:val="CommentText"/>
@@ -14787,7 +14560,7 @@
       </w:r>
     </w:p>
   </w:comment>
-  <w:comment w:id="193" w:author="Hassan Jafari" w:date="2025-10-22T14:17:00Z" w:initials="HJ">
+  <w:comment w:id="194" w:author="Hassan Jafari" w:date="2025-10-22T14:17:00Z" w:initials="HJ">
     <w:p>
       <w:pPr>
         <w:pStyle w:val="CommentText"/>
@@ -14803,7 +14576,7 @@
       </w:r>
     </w:p>
   </w:comment>
-  <w:comment w:id="194" w:author="Hassan Jafari" w:date="2025-10-22T14:18:00Z" w:initials="HJ">
+  <w:comment w:id="195" w:author="Hassan Jafari" w:date="2025-10-22T14:18:00Z" w:initials="HJ">
     <w:p>
       <w:pPr>
         <w:pStyle w:val="CommentText"/>
@@ -14819,7 +14592,7 @@
       </w:r>
     </w:p>
   </w:comment>
-  <w:comment w:id="209" w:author="Hassan Jafari" w:date="2025-10-22T14:20:00Z" w:initials="HJ">
+  <w:comment w:id="210" w:author="Hassan Jafari" w:date="2025-10-22T14:20:00Z" w:initials="HJ">
     <w:p>
       <w:pPr>
         <w:pStyle w:val="CommentText"/>
@@ -14835,7 +14608,7 @@
       </w:r>
     </w:p>
   </w:comment>
-  <w:comment w:id="214" w:author="Hassan Jafari" w:date="2025-10-22T14:24:00Z" w:initials="HJ">
+  <w:comment w:id="215" w:author="Hassan Jafari" w:date="2025-10-22T14:24:00Z" w:initials="HJ">
     <w:p>
       <w:pPr>
         <w:pStyle w:val="CommentText"/>
@@ -14851,7 +14624,7 @@
       </w:r>
     </w:p>
   </w:comment>
-  <w:comment w:id="218" w:author="Hassan Jafari" w:date="2025-10-22T14:25:00Z" w:initials="HJ">
+  <w:comment w:id="219" w:author="Hassan Jafari" w:date="2025-10-22T14:25:00Z" w:initials="HJ">
     <w:p>
       <w:pPr>
         <w:pStyle w:val="CommentText"/>
@@ -14867,7 +14640,7 @@
       </w:r>
     </w:p>
   </w:comment>
-  <w:comment w:id="252" w:author="Hassan Jafari" w:date="2025-10-22T14:29:00Z" w:initials="HJ">
+  <w:comment w:id="253" w:author="Hassan Jafari" w:date="2025-10-22T14:29:00Z" w:initials="HJ">
     <w:p>
       <w:pPr>
         <w:pStyle w:val="CommentText"/>
@@ -14887,7 +14660,7 @@
       </w:r>
     </w:p>
   </w:comment>
-  <w:comment w:id="258" w:author="Hassan Jafari" w:date="2025-10-22T14:30:00Z" w:initials="HJ">
+  <w:comment w:id="259" w:author="Hassan Jafari" w:date="2025-10-22T14:30:00Z" w:initials="HJ">
     <w:p>
       <w:pPr>
         <w:pStyle w:val="CommentText"/>
@@ -14910,6 +14683,8 @@
 <w15:commentsEx xmlns:wpc="http://schemas.microsoft.com/office/word/2010/wordprocessingCanvas" xmlns:cx="http://schemas.microsoft.com/office/drawing/2014/chartex" xmlns:cx1="http://schemas.microsoft.com/office/drawing/2015/9/8/chartex" xmlns:cx2="http://schemas.microsoft.com/office/drawing/2015/10/21/chartex" xmlns:cx3="http://schemas.microsoft.com/office/drawing/2016/5/9/chartex" xmlns:cx4="http://schemas.microsoft.com/office/drawing/2016/5/10/chartex" xmlns:cx5="http://schemas.microsoft.com/office/drawing/2016/5/11/chartex" xmlns:cx6="http://schemas.microsoft.com/office/drawing/2016/5/12/chartex" xmlns:cx7="http://schemas.microsoft.com/office/drawing/2016/5/13/chartex" xmlns:cx8="http://schemas.microsoft.com/office/drawing/2016/5/14/chartex" xmlns:mc="http://schemas.openxmlformats.org/markup-compatibility/2006" xmlns:aink="http://schemas.microsoft.com/office/drawing/2016/ink" xmlns:am3d="http://schemas.microsoft.com/office/drawing/2017/model3d" xmlns:o="urn:schemas-microsoft-com:office:office" xmlns:oel="http://schemas.microsoft.com/office/2019/extlst" xmlns:r="http://schemas.openxmlformats.org/officeDocument/2006/relationships" xmlns:m="http://schemas.openxmlformats.org/officeDocument/2006/math" xmlns:v="urn:schemas-microsoft-com:vml" xmlns:wp14="http://schemas.microsoft.com/office/word/2010/wordprocessingDrawing" xmlns:wp="http://schemas.openxmlformats.org/drawingml/2006/wordprocessingDrawing" xmlns:w10="urn:schemas-microsoft-com:office:word" xmlns:w="http://schemas.openxmlformats.org/wordprocessingml/2006/main" xmlns:w14="http://schemas.microsoft.com/office/word/2010/wordml" xmlns:w15="http://schemas.microsoft.com/office/word/2012/wordml" xmlns:w16cex="http://schemas.microsoft.com/office/word/2018/wordml/cex" xmlns:w16cid="http://schemas.microsoft.com/office/word/2016/wordml/cid" xmlns:w16="http://schemas.microsoft.com/office/word/2018/wordml" xmlns:w16du="http://schemas.microsoft.com/office/word/2023/wordml/word16du" xmlns:w16sdtdh="http://schemas.microsoft.com/office/word/2020/wordml/sdtdatahash" xmlns:w16sdtfl="http://schemas.microsoft.com/office/word/2024/wordml/sdtformatlock" xmlns:w16se="http://schemas.microsoft.com/office/word/2015/wordml/symex" xmlns:wpg="http://schemas.microsoft.com/office/word/2010/wordprocessingGroup" xmlns:wpi="http://schemas.microsoft.com/office/word/2010/wordprocessingInk" xmlns:wne="http://schemas.microsoft.com/office/word/2006/wordml" xmlns:wps="http://schemas.microsoft.com/office/word/2010/wordprocessingShape" mc:Ignorable="w14 w15 w16se w16cid w16 w16cex w16sdtdh w16sdtfl w16du wp14">
   <w15:commentEx w15:paraId="03247B25" w15:done="0"/>
   <w15:commentEx w15:paraId="5DFAE595" w15:done="0"/>
+  <w15:commentEx w15:paraId="7A1DFB76" w15:paraIdParent="5DFAE595" w15:done="0"/>
+  <w15:commentEx w15:paraId="1F25950F" w15:done="0"/>
   <w15:commentEx w15:paraId="7906B283" w15:done="0"/>
   <w15:commentEx w15:paraId="3A1C80BA" w15:done="0"/>
   <w15:commentEx w15:paraId="78E75FC8" w15:done="0"/>
@@ -14929,6 +14704,8 @@
 <w16cex:commentsExtensible xmlns:wpc="http://schemas.microsoft.com/office/word/2010/wordprocessingCanvas" xmlns:cx="http://schemas.microsoft.com/office/drawing/2014/chartex" xmlns:cx1="http://schemas.microsoft.com/office/drawing/2015/9/8/chartex" xmlns:cx2="http://schemas.microsoft.com/office/drawing/2015/10/21/chartex" xmlns:cx3="http://schemas.microsoft.com/office/drawing/2016/5/9/chartex" xmlns:cx4="http://schemas.microsoft.com/office/drawing/2016/5/10/chartex" xmlns:cx5="http://schemas.microsoft.com/office/drawing/2016/5/11/chartex" xmlns:cx6="http://schemas.microsoft.com/office/drawing/2016/5/12/chartex" xmlns:cx7="http://schemas.microsoft.com/office/drawing/2016/5/13/chartex" xmlns:cx8="http://schemas.microsoft.com/office/drawing/2016/5/14/chartex" xmlns:cr="http://schemas.microsoft.com/office/comments/2020/reactions" xmlns:mc="http://schemas.openxmlformats.org/markup-compatibility/2006" xmlns:aink="http://schemas.microsoft.com/office/drawing/2016/ink" xmlns:am3d="http://schemas.microsoft.com/office/drawing/2017/model3d" xmlns:o="urn:schemas-microsoft-com:office:office" xmlns:oel="http://schemas.microsoft.com/office/2019/extlst" xmlns:r="http://schemas.openxmlformats.org/officeDocument/2006/relationships" xmlns:m="http://schemas.openxmlformats.org/officeDocument/2006/math" xmlns:v="urn:schemas-microsoft-com:vml" xmlns:wp14="http://schemas.microsoft.com/office/word/2010/wordprocessingDrawing" xmlns:wp="http://schemas.openxmlformats.org/drawingml/2006/wordprocessingDrawing" xmlns:w10="urn:schemas-microsoft-com:office:word" xmlns:w="http://schemas.openxmlformats.org/wordprocessingml/2006/main" xmlns:w14="http://schemas.microsoft.com/office/word/2010/wordml" xmlns:w15="http://schemas.microsoft.com/office/word/2012/wordml" xmlns:w16cex="http://schemas.microsoft.com/office/word/2018/wordml/cex" xmlns:w16cid="http://schemas.microsoft.com/office/word/2016/wordml/cid" xmlns:w16="http://schemas.microsoft.com/office/word/2018/wordml" xmlns:w16du="http://schemas.microsoft.com/office/word/2023/wordml/word16du" xmlns:w16sdtdh="http://schemas.microsoft.com/office/word/2020/wordml/sdtdatahash" xmlns:w16sdtfl="http://schemas.microsoft.com/office/word/2024/wordml/sdtformatlock" xmlns:w16se="http://schemas.microsoft.com/office/word/2015/wordml/symex" xmlns:wpg="http://schemas.microsoft.com/office/word/2010/wordprocessingGroup" xmlns:wpi="http://schemas.microsoft.com/office/word/2010/wordprocessingInk" xmlns:wne="http://schemas.microsoft.com/office/word/2006/wordml" xmlns:wps="http://schemas.microsoft.com/office/word/2010/wordprocessingShape" mc:Ignorable="w14 w15 w16se w16cid w16 w16cex w16sdtdh w16sdtfl cr w16du wp14">
   <w16cex:commentExtensible w16cex:durableId="3416BAD3" w16cex:dateUtc="2025-11-21T16:48:00Z"/>
   <w16cex:commentExtensible w16cex:durableId="21058514" w16cex:dateUtc="2025-10-22T10:21:00Z"/>
+  <w16cex:commentExtensible w16cex:durableId="53FA8417" w16cex:dateUtc="2025-11-25T12:01:00Z"/>
+  <w16cex:commentExtensible w16cex:durableId="486E5017" w16cex:dateUtc="2025-11-25T12:03:00Z"/>
   <w16cex:commentExtensible w16cex:durableId="5E04373E" w16cex:dateUtc="2025-11-16T17:44:00Z"/>
   <w16cex:commentExtensible w16cex:durableId="71262F9B" w16cex:dateUtc="2025-11-16T17:56:00Z"/>
   <w16cex:commentExtensible w16cex:durableId="3E40C66F" w16cex:dateUtc="2025-11-16T18:07:00Z"/>
@@ -14948,6 +14725,8 @@
 <w16cid:commentsIds xmlns:wpc="http://schemas.microsoft.com/office/word/2010/wordprocessingCanvas" xmlns:cx="http://schemas.microsoft.com/office/drawing/2014/chartex" xmlns:cx1="http://schemas.microsoft.com/office/drawing/2015/9/8/chartex" xmlns:cx2="http://schemas.microsoft.com/office/drawing/2015/10/21/chartex" xmlns:cx3="http://schemas.microsoft.com/office/drawing/2016/5/9/chartex" xmlns:cx4="http://schemas.microsoft.com/office/drawing/2016/5/10/chartex" xmlns:cx5="http://schemas.microsoft.com/office/drawing/2016/5/11/chartex" xmlns:cx6="http://schemas.microsoft.com/office/drawing/2016/5/12/chartex" xmlns:cx7="http://schemas.microsoft.com/office/drawing/2016/5/13/chartex" xmlns:cx8="http://schemas.microsoft.com/office/drawing/2016/5/14/chartex" xmlns:mc="http://schemas.openxmlformats.org/markup-compatibility/2006" xmlns:aink="http://schemas.microsoft.com/office/drawing/2016/ink" xmlns:am3d="http://schemas.microsoft.com/office/drawing/2017/model3d" xmlns:o="urn:schemas-microsoft-com:office:office" xmlns:oel="http://schemas.microsoft.com/office/2019/extlst" xmlns:r="http://schemas.openxmlformats.org/officeDocument/2006/relationships" xmlns:m="http://schemas.openxmlformats.org/officeDocument/2006/math" xmlns:v="urn:schemas-microsoft-com:vml" xmlns:wp14="http://schemas.microsoft.com/office/word/2010/wordprocessingDrawing" xmlns:wp="http://schemas.openxmlformats.org/drawingml/2006/wordprocessingDrawing" xmlns:w10="urn:schemas-microsoft-com:office:word" xmlns:w="http://schemas.openxmlformats.org/wordprocessingml/2006/main" xmlns:w14="http://schemas.microsoft.com/office/word/2010/wordml" xmlns:w15="http://schemas.microsoft.com/office/word/2012/wordml" xmlns:w16cex="http://schemas.microsoft.com/office/word/2018/wordml/cex" xmlns:w16cid="http://schemas.microsoft.com/office/word/2016/wordml/cid" xmlns:w16="http://schemas.microsoft.com/office/word/2018/wordml" xmlns:w16du="http://schemas.microsoft.com/office/word/2023/wordml/word16du" xmlns:w16sdtdh="http://schemas.microsoft.com/office/word/2020/wordml/sdtdatahash" xmlns:w16sdtfl="http://schemas.microsoft.com/office/word/2024/wordml/sdtformatlock" xmlns:w16se="http://schemas.microsoft.com/office/word/2015/wordml/symex" xmlns:wpg="http://schemas.microsoft.com/office/word/2010/wordprocessingGroup" xmlns:wpi="http://schemas.microsoft.com/office/word/2010/wordprocessingInk" xmlns:wne="http://schemas.microsoft.com/office/word/2006/wordml" xmlns:wps="http://schemas.microsoft.com/office/word/2010/wordprocessingShape" mc:Ignorable="w14 w15 w16se w16cid w16 w16cex w16sdtdh w16sdtfl w16du wp14">
   <w16cid:commentId w16cid:paraId="03247B25" w16cid:durableId="3416BAD3"/>
   <w16cid:commentId w16cid:paraId="5DFAE595" w16cid:durableId="21058514"/>
+  <w16cid:commentId w16cid:paraId="7A1DFB76" w16cid:durableId="53FA8417"/>
+  <w16cid:commentId w16cid:paraId="1F25950F" w16cid:durableId="486E5017"/>
   <w16cid:commentId w16cid:paraId="7906B283" w16cid:durableId="5E04373E"/>
   <w16cid:commentId w16cid:paraId="3A1C80BA" w16cid:durableId="71262F9B"/>
   <w16cid:commentId w16cid:paraId="78E75FC8" w16cid:durableId="3E40C66F"/>
@@ -15287,12 +15066,12 @@
     <w:pPr>
       <w:pStyle w:val="Header"/>
     </w:pPr>
-    <w:ins w:id="248" w:author="Aleksandra Kata" w:date="2024-11-21T01:56:00Z" w16du:dateUtc="2024-11-21T01:56:00Z">
+    <w:ins w:id="249" w:author="Aleksandra Kata" w:date="2024-11-21T01:56:00Z" w16du:dateUtc="2024-11-21T01:56:00Z">
       <w:r>
         <w:rPr>
           <w:noProof/>
         </w:rPr>
-        <w:pict w14:anchorId="499F0F1F">
+        <w:pict w14:anchorId="1DD9A1FA">
           <v:shapetype id="_x0000_t136" coordsize="21600,21600" o:spt="136" adj="10800" path="m@7,l@8,m@5,21600l@6,21600e">
             <v:formulas>
               <v:f eqn="sum #0 0 10800"/>
@@ -15342,7 +15121,7 @@
       <w:rPr>
         <w:noProof/>
       </w:rPr>
-      <w:pict w14:anchorId="15FACFA8">
+      <w:pict w14:anchorId="0B045D9E">
         <v:shapetype id="_x0000_t136" coordsize="21600,21600" o:spt="136" adj="10800" path="m@7,l@8,m@5,21600l@6,21600e">
           <v:formulas>
             <v:f eqn="sum #0 0 10800"/>
@@ -15561,12 +15340,12 @@
     <w:pPr>
       <w:pStyle w:val="Header"/>
     </w:pPr>
-    <w:ins w:id="249" w:author="Aleksandra Kata" w:date="2024-11-21T01:56:00Z" w16du:dateUtc="2024-11-21T01:56:00Z">
+    <w:ins w:id="250" w:author="Aleksandra Kata" w:date="2024-11-21T01:56:00Z" w16du:dateUtc="2024-11-21T01:56:00Z">
       <w:r>
         <w:rPr>
           <w:noProof/>
         </w:rPr>
-        <w:pict w14:anchorId="49EE8BDD">
+        <w:pict w14:anchorId="03B149AB">
           <v:shapetype id="_x0000_t136" coordsize="21600,21600" o:spt="136" adj="10800" path="m@7,l@8,m@5,21600l@6,21600e">
             <v:formulas>
               <v:f eqn="sum #0 0 10800"/>
@@ -21176,12 +20955,7 @@
 </file>
 
 <file path=customXml/item1.xml><?xml version="1.0" encoding="utf-8"?>
-<?mso-contentType ?>
-<FormTemplates xmlns="http://schemas.microsoft.com/sharepoint/v3/contenttype/forms">
-  <Display>DocumentLibraryForm</Display>
-  <Edit>DocumentLibraryForm</Edit>
-  <New>DocumentLibraryForm</New>
-</FormTemplates>
+<b:Sources xmlns:b="http://schemas.openxmlformats.org/officeDocument/2006/bibliography" xmlns="http://schemas.openxmlformats.org/officeDocument/2006/bibliography" SelectedStyle="\APA.XSL" StyleName="APA"/>
 </file>
 
 <file path=customXml/item2.xml><?xml version="1.0" encoding="utf-8"?>
@@ -21363,7 +21137,12 @@
 </file>
 
 <file path=customXml/item3.xml><?xml version="1.0" encoding="utf-8"?>
-<b:Sources xmlns:b="http://schemas.openxmlformats.org/officeDocument/2006/bibliography" xmlns="http://schemas.openxmlformats.org/officeDocument/2006/bibliography" SelectedStyle="\APA.XSL" StyleName="APA"/>
+<?mso-contentType ?>
+<FormTemplates xmlns="http://schemas.microsoft.com/sharepoint/v3/contenttype/forms">
+  <Display>DocumentLibraryForm</Display>
+  <Edit>DocumentLibraryForm</Edit>
+  <New>DocumentLibraryForm</New>
+</FormTemplates>
 </file>
 
 <file path=customXml/item4.xml><?xml version="1.0" encoding="utf-8"?>
@@ -21377,9 +21156,9 @@
 </file>
 
 <file path=customXml/itemProps1.xml><?xml version="1.0" encoding="utf-8"?>
-<ds:datastoreItem xmlns:ds="http://schemas.openxmlformats.org/officeDocument/2006/customXml" ds:itemID="{BAA3AF65-3B33-49AB-8B14-14BA3FFBE156}">
+<ds:datastoreItem xmlns:ds="http://schemas.openxmlformats.org/officeDocument/2006/customXml" ds:itemID="{AE3D3812-69AC-4D6A-A7F1-6E3602D960E0}">
   <ds:schemaRefs>
-    <ds:schemaRef ds:uri="http://schemas.microsoft.com/sharepoint/v3/contenttype/forms"/>
+    <ds:schemaRef ds:uri="http://schemas.openxmlformats.org/officeDocument/2006/bibliography"/>
   </ds:schemaRefs>
 </ds:datastoreItem>
 </file>
@@ -21403,9 +21182,9 @@
 </file>
 
 <file path=customXml/itemProps3.xml><?xml version="1.0" encoding="utf-8"?>
-<ds:datastoreItem xmlns:ds="http://schemas.openxmlformats.org/officeDocument/2006/customXml" ds:itemID="{AE3D3812-69AC-4D6A-A7F1-6E3602D960E0}">
+<ds:datastoreItem xmlns:ds="http://schemas.openxmlformats.org/officeDocument/2006/customXml" ds:itemID="{BAA3AF65-3B33-49AB-8B14-14BA3FFBE156}">
   <ds:schemaRefs>
-    <ds:schemaRef ds:uri="http://schemas.openxmlformats.org/officeDocument/2006/bibliography"/>
+    <ds:schemaRef ds:uri="http://schemas.microsoft.com/sharepoint/v3/contenttype/forms"/>
   </ds:schemaRefs>
 </ds:datastoreItem>
 </file>

</xml_diff>